<commit_message>
updating resume file downloadables
</commit_message>
<xml_diff>
--- a/assets/downloads/steven-stuart-resume.docx
+++ b/assets/downloads/steven-stuart-resume.docx
@@ -28,6 +28,7 @@
         <w:rPr>
           <w:rFonts w:ascii="Cambria" w:cs="Cambria" w:eastAsia="Cambria" w:hAnsi="Cambria"/>
           <w:b w:val="1"/>
+          <w:bCs w:val="1"/>
           <w:rtl w:val="0"/>
         </w:rPr>
         <w:t xml:space="preserve">Software Architect</w:t>
@@ -133,7 +134,7 @@
           <w:rFonts w:ascii="Cambria" w:cs="Cambria" w:eastAsia="Cambria" w:hAnsi="Cambria"/>
           <w:rtl w:val="0"/>
         </w:rPr>
-        <w:t xml:space="preserve">Software architect with 15+ years designing and building cloud-native platforms, distributed systems, and scalable architectures. Proven track record of reducing infrastructure costs, strengthening security posture, and leading technical teams.</w:t>
+        <w:t xml:space="preserve">Software architect with 15 years of experience building web and desktop applications, microservices, and event-driven systems serving millions of users across hundreds of financial institutions. My focus is on simplifying complex systems and processes so teams ship with confidence and infrastructure costs stay under control.</w:t>
       </w:r>
     </w:p>
     <w:p>
@@ -189,7 +190,7 @@
           <w:rFonts w:ascii="Cambria" w:cs="Cambria" w:eastAsia="Cambria" w:hAnsi="Cambria"/>
           <w:rtl w:val="0"/>
         </w:rPr>
-        <w:t xml:space="preserve">Led complete modernization of cloud infrastructure and development operations for a financial research platform serving investors. Directed architecture strategy, mentored engineering team, and delivered secure, scalable solutions aligned with business objectives.</w:t>
+        <w:t xml:space="preserve">Led modernization of cloud infrastructure and development operations for a financial research platform. Directed architecture strategy, mentored the engineering team, and delivered secure, scalable solutions aligned with business objectives.</w:t>
       </w:r>
     </w:p>
     <w:p>
@@ -229,6 +230,7 @@
         <w:rPr>
           <w:rFonts w:ascii="Cambria" w:cs="Cambria" w:eastAsia="Cambria" w:hAnsi="Cambria"/>
           <w:b w:val="1"/>
+          <w:bCs w:val="1"/>
           <w:rtl w:val="0"/>
         </w:rPr>
         <w:t xml:space="preserve">Key Achievements:</w:t>
@@ -243,14 +245,20 @@
       <w:pPr>
         <w:numPr>
           <w:ilvl w:val="0"/>
-          <w:numId w:val="1"/>
+          <w:numId w:val="4"/>
         </w:numPr>
         <w:ind w:left="720" w:hanging="360"/>
-      </w:pPr>
-      <w:r>
-        <w:rPr>
-          <w:rFonts w:ascii="Cambria" w:cs="Cambria" w:eastAsia="Cambria" w:hAnsi="Cambria"/>
-          <w:b w:val="1"/>
+        <w:rPr>
+          <w:rFonts w:ascii="Cambria" w:cs="Cambria" w:eastAsia="Cambria" w:hAnsi="Cambria"/>
+          <w:sz w:val="22"/>
+          <w:szCs w:val="22"/>
+        </w:rPr>
+      </w:pPr>
+      <w:r>
+        <w:rPr>
+          <w:rFonts w:ascii="Cambria" w:cs="Cambria" w:eastAsia="Cambria" w:hAnsi="Cambria"/>
+          <w:b w:val="1"/>
+          <w:bCs w:val="1"/>
           <w:rtl w:val="0"/>
         </w:rPr>
         <w:t xml:space="preserve">Reduced cloud costs 80%</w:t>
@@ -260,21 +268,27 @@
           <w:rFonts w:ascii="Cambria" w:cs="Cambria" w:eastAsia="Cambria" w:hAnsi="Cambria"/>
           <w:rtl w:val="0"/>
         </w:rPr>
-        <w:t xml:space="preserve"> through infrastructure optimization and service consolidation</w:t>
+        <w:t xml:space="preserve"> through infrastructure optimization and service consolidation, cutting complexity without sacrificing capability</w:t>
       </w:r>
     </w:p>
     <w:p>
       <w:pPr>
         <w:numPr>
           <w:ilvl w:val="0"/>
-          <w:numId w:val="1"/>
+          <w:numId w:val="4"/>
         </w:numPr>
         <w:ind w:left="720" w:hanging="360"/>
-      </w:pPr>
-      <w:r>
-        <w:rPr>
-          <w:rFonts w:ascii="Cambria" w:cs="Cambria" w:eastAsia="Cambria" w:hAnsi="Cambria"/>
-          <w:b w:val="1"/>
+        <w:rPr>
+          <w:rFonts w:ascii="Cambria" w:cs="Cambria" w:eastAsia="Cambria" w:hAnsi="Cambria"/>
+          <w:sz w:val="22"/>
+          <w:szCs w:val="22"/>
+        </w:rPr>
+      </w:pPr>
+      <w:r>
+        <w:rPr>
+          <w:rFonts w:ascii="Cambria" w:cs="Cambria" w:eastAsia="Cambria" w:hAnsi="Cambria"/>
+          <w:b w:val="1"/>
+          <w:bCs w:val="1"/>
           <w:rtl w:val="0"/>
         </w:rPr>
         <w:t xml:space="preserve">Enhanced security posture</w:t>
@@ -291,38 +305,50 @@
       <w:pPr>
         <w:numPr>
           <w:ilvl w:val="0"/>
-          <w:numId w:val="1"/>
+          <w:numId w:val="4"/>
         </w:numPr>
         <w:ind w:left="720" w:hanging="360"/>
-      </w:pPr>
-      <w:r>
-        <w:rPr>
-          <w:rFonts w:ascii="Cambria" w:cs="Cambria" w:eastAsia="Cambria" w:hAnsi="Cambria"/>
-          <w:b w:val="1"/>
-          <w:rtl w:val="0"/>
-        </w:rPr>
-        <w:t xml:space="preserve">Eliminated transaction instability</w:t>
-      </w:r>
-      <w:r>
-        <w:rPr>
-          <w:rFonts w:ascii="Cambria" w:cs="Cambria" w:eastAsia="Cambria" w:hAnsi="Cambria"/>
-          <w:rtl w:val="0"/>
-        </w:rPr>
-        <w:t xml:space="preserve"> by rearchitecting service-based architecture, dramatically improving reliability for sales operations and client applications</w:t>
+        <w:rPr>
+          <w:rFonts w:ascii="Cambria" w:cs="Cambria" w:eastAsia="Cambria" w:hAnsi="Cambria"/>
+          <w:sz w:val="22"/>
+          <w:szCs w:val="22"/>
+        </w:rPr>
+      </w:pPr>
+      <w:r>
+        <w:rPr>
+          <w:rFonts w:ascii="Cambria" w:cs="Cambria" w:eastAsia="Cambria" w:hAnsi="Cambria"/>
+          <w:b w:val="1"/>
+          <w:bCs w:val="1"/>
+          <w:rtl w:val="0"/>
+        </w:rPr>
+        <w:t xml:space="preserve">Stabilized unreliable transaction architecture</w:t>
+      </w:r>
+      <w:r>
+        <w:rPr>
+          <w:rFonts w:ascii="Cambria" w:cs="Cambria" w:eastAsia="Cambria" w:hAnsi="Cambria"/>
+          <w:rtl w:val="0"/>
+        </w:rPr>
+        <w:t xml:space="preserve"> by redesigning service boundaries, improving reliability for sales operations and client-facing applications</w:t>
       </w:r>
     </w:p>
     <w:p>
       <w:pPr>
         <w:numPr>
           <w:ilvl w:val="0"/>
-          <w:numId w:val="1"/>
+          <w:numId w:val="4"/>
         </w:numPr>
         <w:ind w:left="720" w:hanging="360"/>
-      </w:pPr>
-      <w:r>
-        <w:rPr>
-          <w:rFonts w:ascii="Cambria" w:cs="Cambria" w:eastAsia="Cambria" w:hAnsi="Cambria"/>
-          <w:b w:val="1"/>
+        <w:rPr>
+          <w:rFonts w:ascii="Cambria" w:cs="Cambria" w:eastAsia="Cambria" w:hAnsi="Cambria"/>
+          <w:sz w:val="22"/>
+          <w:szCs w:val="22"/>
+        </w:rPr>
+      </w:pPr>
+      <w:r>
+        <w:rPr>
+          <w:rFonts w:ascii="Cambria" w:cs="Cambria" w:eastAsia="Cambria" w:hAnsi="Cambria"/>
+          <w:b w:val="1"/>
+          <w:bCs w:val="1"/>
           <w:rtl w:val="0"/>
         </w:rPr>
         <w:t xml:space="preserve">Improved platform performance</w:t>
@@ -332,31 +358,287 @@
           <w:rFonts w:ascii="Cambria" w:cs="Cambria" w:eastAsia="Cambria" w:hAnsi="Cambria"/>
           <w:rtl w:val="0"/>
         </w:rPr>
-        <w:t xml:space="preserve"> by rearchitecting data layer with Aurora, DynamoDB, and Snowflake</w:t>
+        <w:t xml:space="preserve"> by rearchitecting the data layer with Aurora, DynamoDB, and Snowflake, reducing average API response time from over 1 second to 40ms and database CPU utilization from 85% to 10%</w:t>
       </w:r>
     </w:p>
     <w:p>
       <w:pPr>
         <w:numPr>
           <w:ilvl w:val="0"/>
-          <w:numId w:val="1"/>
+          <w:numId w:val="4"/>
         </w:numPr>
         <w:ind w:left="720" w:hanging="360"/>
-      </w:pPr>
-      <w:r>
-        <w:rPr>
-          <w:rFonts w:ascii="Cambria" w:cs="Cambria" w:eastAsia="Cambria" w:hAnsi="Cambria"/>
-          <w:b w:val="1"/>
-          <w:rtl w:val="0"/>
-        </w:rPr>
-        <w:t xml:space="preserve">Accelerated deployment velocity</w:t>
-      </w:r>
-      <w:r>
-        <w:rPr>
-          <w:rFonts w:ascii="Cambria" w:cs="Cambria" w:eastAsia="Cambria" w:hAnsi="Cambria"/>
-          <w:rtl w:val="0"/>
-        </w:rPr>
-        <w:t xml:space="preserve"> by implementing CI/CD pipelines and automated testing environments</w:t>
+        <w:rPr>
+          <w:rFonts w:ascii="Cambria" w:cs="Cambria" w:eastAsia="Cambria" w:hAnsi="Cambria"/>
+          <w:sz w:val="22"/>
+          <w:szCs w:val="22"/>
+        </w:rPr>
+      </w:pPr>
+      <w:r>
+        <w:rPr>
+          <w:rFonts w:ascii="Cambria" w:cs="Cambria" w:eastAsia="Cambria" w:hAnsi="Cambria"/>
+          <w:b w:val="1"/>
+          <w:bCs w:val="1"/>
+          <w:rtl w:val="0"/>
+        </w:rPr>
+        <w:t xml:space="preserve">Introduced a Shape Up hybrid SDLC</w:t>
+      </w:r>
+      <w:r>
+        <w:rPr>
+          <w:rFonts w:ascii="Cambria" w:cs="Cambria" w:eastAsia="Cambria" w:hAnsi="Cambria"/>
+          <w:rtl w:val="0"/>
+        </w:rPr>
+        <w:t xml:space="preserve">, organizing work around completed features rather than sprint intervals, cutting bug fix turnaround from months to days and feature delivery from weeks to days</w:t>
+      </w:r>
+    </w:p>
+    <w:p>
+      <w:pPr>
+        <w:numPr>
+          <w:ilvl w:val="0"/>
+          <w:numId w:val="4"/>
+        </w:numPr>
+        <w:ind w:left="720" w:hanging="360"/>
+        <w:rPr>
+          <w:rFonts w:ascii="Cambria" w:cs="Cambria" w:eastAsia="Cambria" w:hAnsi="Cambria"/>
+          <w:sz w:val="22"/>
+          <w:szCs w:val="22"/>
+        </w:rPr>
+      </w:pPr>
+      <w:r>
+        <w:rPr>
+          <w:rFonts w:ascii="Cambria" w:cs="Cambria" w:eastAsia="Cambria" w:hAnsi="Cambria"/>
+          <w:b w:val="1"/>
+          <w:bCs w:val="1"/>
+          <w:rtl w:val="0"/>
+        </w:rPr>
+        <w:t xml:space="preserve">Integrated AI-assisted code generation </w:t>
+      </w:r>
+      <w:r>
+        <w:rPr>
+          <w:rFonts w:ascii="Cambria" w:cs="Cambria" w:eastAsia="Cambria" w:hAnsi="Cambria"/>
+          <w:rtl w:val="0"/>
+        </w:rPr>
+        <w:t xml:space="preserve">into development workflow, accelerating code deliverables by roughly 70% and nearly eliminating production defects in new feature releases</w:t>
+      </w:r>
+    </w:p>
+    <w:p>
+      <w:pPr>
+        <w:numPr>
+          <w:ilvl w:val="0"/>
+          <w:numId w:val="4"/>
+        </w:numPr>
+        <w:ind w:left="720" w:hanging="360"/>
+        <w:rPr>
+          <w:rFonts w:ascii="Cambria" w:cs="Cambria" w:eastAsia="Cambria" w:hAnsi="Cambria"/>
+          <w:sz w:val="22"/>
+          <w:szCs w:val="22"/>
+        </w:rPr>
+      </w:pPr>
+      <w:r>
+        <w:rPr>
+          <w:rFonts w:ascii="Cambria" w:cs="Cambria" w:eastAsia="Cambria" w:hAnsi="Cambria"/>
+          <w:b w:val="1"/>
+          <w:bCs w:val="1"/>
+          <w:rtl w:val="0"/>
+        </w:rPr>
+        <w:t xml:space="preserve">Accelerated deployment speed</w:t>
+      </w:r>
+      <w:r>
+        <w:rPr>
+          <w:rFonts w:ascii="Cambria" w:cs="Cambria" w:eastAsia="Cambria" w:hAnsi="Cambria"/>
+          <w:rtl w:val="0"/>
+        </w:rPr>
+        <w:t xml:space="preserve"> with CI/CD pipelines and automated testing environments, reducing production deployment time from 30 minutes to 5 minutes</w:t>
+      </w:r>
+    </w:p>
+    <w:p>
+      <w:pPr>
+        <w:rPr>
+          <w:rFonts w:ascii="Cambria" w:cs="Cambria" w:eastAsia="Cambria" w:hAnsi="Cambria"/>
+          <w:i w:val="1"/>
+          <w:iCs w:val="1"/>
+        </w:rPr>
+      </w:pPr>
+      <w:r>
+        <w:rPr>
+          <w:rtl w:val="0"/>
+        </w:rPr>
+      </w:r>
+    </w:p>
+    <w:p>
+      <w:pPr>
+        <w:rPr>
+          <w:rFonts w:ascii="Cambria" w:cs="Cambria" w:eastAsia="Cambria" w:hAnsi="Cambria"/>
+        </w:rPr>
+      </w:pPr>
+      <w:r>
+        <w:rPr>
+          <w:rFonts w:ascii="Cambria" w:cs="Cambria" w:eastAsia="Cambria" w:hAnsi="Cambria"/>
+          <w:i w:val="1"/>
+          <w:iCs w:val="1"/>
+          <w:rtl w:val="0"/>
+        </w:rPr>
+        <w:t xml:space="preserve">Technologies: .NET 8, ASP.NET Core, AWS EKS, GraphQL (HotChocolate), Aurora PostgreSQL, DynamoDB, Snowflake, EventBridge, CloudFront, WAF, CodeBuild, Vue.js, Claude AI</w:t>
+      </w:r>
+      <w:r>
+        <w:rPr>
+          <w:rtl w:val="0"/>
+        </w:rPr>
+      </w:r>
+    </w:p>
+    <w:p>
+      <w:pPr>
+        <w:pStyle w:val="Heading3"/>
+        <w:rPr>
+          <w:rFonts w:ascii="Cambria" w:cs="Cambria" w:eastAsia="Cambria" w:hAnsi="Cambria"/>
+          <w:sz w:val="26"/>
+          <w:szCs w:val="26"/>
+        </w:rPr>
+      </w:pPr>
+      <w:bookmarkStart w:colFirst="0" w:colLast="0" w:name="_9723osvu0eim" w:id="3"/>
+      <w:bookmarkEnd w:id="3"/>
+      <w:r>
+        <w:rPr>
+          <w:rFonts w:ascii="Cambria" w:cs="Cambria" w:eastAsia="Cambria" w:hAnsi="Cambria"/>
+          <w:sz w:val="26"/>
+          <w:szCs w:val="26"/>
+          <w:rtl w:val="0"/>
+        </w:rPr>
+        <w:t xml:space="preserve">Senior Software Engineer II | Alkami Technology — Plano, TX | Jul 2018 – Jan 2023</w:t>
+      </w:r>
+    </w:p>
+    <w:p>
+      <w:pPr>
+        <w:rPr>
+          <w:rFonts w:ascii="Cambria" w:cs="Cambria" w:eastAsia="Cambria" w:hAnsi="Cambria"/>
+        </w:rPr>
+      </w:pPr>
+      <w:r>
+        <w:rPr>
+          <w:rFonts w:ascii="Cambria" w:cs="Cambria" w:eastAsia="Cambria" w:hAnsi="Cambria"/>
+          <w:rtl w:val="0"/>
+        </w:rPr>
+        <w:t xml:space="preserve">Built scalable microservices and event-driven systems for digital banking platform serving millions of users across 200+ financial institutions. Collaborated in Agile environment to deliver high-quality features while mentoring team members on architectural best practices.</w:t>
+      </w:r>
+    </w:p>
+    <w:p>
+      <w:pPr>
+        <w:rPr>
+          <w:rFonts w:ascii="Cambria" w:cs="Cambria" w:eastAsia="Cambria" w:hAnsi="Cambria"/>
+        </w:rPr>
+      </w:pPr>
+      <w:r>
+        <w:rPr>
+          <w:rtl w:val="0"/>
+        </w:rPr>
+      </w:r>
+    </w:p>
+    <w:p>
+      <w:pPr>
+        <w:rPr>
+          <w:rFonts w:ascii="Cambria" w:cs="Cambria" w:eastAsia="Cambria" w:hAnsi="Cambria"/>
+          <w:b w:val="1"/>
+          <w:bCs w:val="1"/>
+        </w:rPr>
+      </w:pPr>
+      <w:r>
+        <w:rPr>
+          <w:rFonts w:ascii="Cambria" w:cs="Cambria" w:eastAsia="Cambria" w:hAnsi="Cambria"/>
+          <w:b w:val="1"/>
+          <w:bCs w:val="1"/>
+          <w:rtl w:val="0"/>
+        </w:rPr>
+        <w:t xml:space="preserve">Key Achievements:</w:t>
+      </w:r>
+    </w:p>
+    <w:p>
+      <w:pPr>
+        <w:numPr>
+          <w:ilvl w:val="0"/>
+          <w:numId w:val="2"/>
+        </w:numPr>
+        <w:ind w:left="720" w:hanging="360"/>
+        <w:rPr>
+          <w:rFonts w:ascii="Cambria" w:cs="Cambria" w:eastAsia="Cambria" w:hAnsi="Cambria"/>
+          <w:sz w:val="22"/>
+          <w:szCs w:val="22"/>
+        </w:rPr>
+      </w:pPr>
+      <w:r>
+        <w:rPr>
+          <w:rFonts w:ascii="Cambria" w:cs="Cambria" w:eastAsia="Cambria" w:hAnsi="Cambria"/>
+          <w:b w:val="1"/>
+          <w:bCs w:val="1"/>
+          <w:rtl w:val="0"/>
+        </w:rPr>
+        <w:t xml:space="preserve">Pioneered serverless architecture</w:t>
+      </w:r>
+      <w:r>
+        <w:rPr>
+          <w:rFonts w:ascii="Cambria" w:cs="Cambria" w:eastAsia="Cambria" w:hAnsi="Cambria"/>
+          <w:rtl w:val="0"/>
+        </w:rPr>
+        <w:t xml:space="preserve"> by developing Alkami’s first AWS Lambda-based APIs, establishing patterns adopted across engineering teams</w:t>
+      </w:r>
+    </w:p>
+    <w:p>
+      <w:pPr>
+        <w:numPr>
+          <w:ilvl w:val="0"/>
+          <w:numId w:val="2"/>
+        </w:numPr>
+        <w:ind w:left="720" w:hanging="360"/>
+        <w:rPr>
+          <w:rFonts w:ascii="Cambria" w:cs="Cambria" w:eastAsia="Cambria" w:hAnsi="Cambria"/>
+          <w:sz w:val="22"/>
+          <w:szCs w:val="22"/>
+        </w:rPr>
+      </w:pPr>
+      <w:r>
+        <w:rPr>
+          <w:rFonts w:ascii="Cambria" w:cs="Cambria" w:eastAsia="Cambria" w:hAnsi="Cambria"/>
+          <w:b w:val="1"/>
+          <w:bCs w:val="1"/>
+          <w:rtl w:val="0"/>
+        </w:rPr>
+        <w:t xml:space="preserve">Launched real-time notification platform</w:t>
+      </w:r>
+      <w:r>
+        <w:rPr>
+          <w:rFonts w:ascii="Cambria" w:cs="Cambria" w:eastAsia="Cambria" w:hAnsi="Cambria"/>
+          <w:rtl w:val="0"/>
+        </w:rPr>
+        <w:t xml:space="preserve"> enabling banks to deliver instant alerts to customers across web and mobile channels</w:t>
+      </w:r>
+    </w:p>
+    <w:p>
+      <w:pPr>
+        <w:numPr>
+          <w:ilvl w:val="0"/>
+          <w:numId w:val="2"/>
+        </w:numPr>
+        <w:ind w:left="720" w:hanging="360"/>
+        <w:rPr>
+          <w:rFonts w:ascii="Cambria" w:cs="Cambria" w:eastAsia="Cambria" w:hAnsi="Cambria"/>
+          <w:sz w:val="22"/>
+          <w:szCs w:val="22"/>
+        </w:rPr>
+      </w:pPr>
+      <w:r>
+        <w:rPr>
+          <w:rFonts w:ascii="Cambria" w:cs="Cambria" w:eastAsia="Cambria" w:hAnsi="Cambria"/>
+          <w:b w:val="1"/>
+          <w:bCs w:val="1"/>
+          <w:rtl w:val="0"/>
+        </w:rPr>
+        <w:t xml:space="preserve">Drove automated test quality and coverage</w:t>
+      </w:r>
+      <w:r>
+        <w:rPr>
+          <w:rFonts w:ascii="Cambria" w:cs="Cambria" w:eastAsia="Cambria" w:hAnsi="Cambria"/>
+          <w:rtl w:val="0"/>
+        </w:rPr>
+        <w:t xml:space="preserve"> across microservices, strengthening production reliability for a platform serving millions of banking customers</w:t>
       </w:r>
     </w:p>
     <w:p>
@@ -396,9 +678,10 @@
         <w:rPr>
           <w:rFonts w:ascii="Cambria" w:cs="Cambria" w:eastAsia="Cambria" w:hAnsi="Cambria"/>
           <w:i w:val="1"/>
-          <w:rtl w:val="0"/>
-        </w:rPr>
-        <w:t xml:space="preserve">Technologies: .NET 8, ASP.NET Core, AWS EKS, GraphQL (HotChocolate), Aurora PostgreSQL, DynamoDB, Snowflake, EventBridge, CloudFront, WAF, CodeBuild, Vue.js, .NET MAUI</w:t>
+          <w:iCs w:val="1"/>
+          <w:rtl w:val="0"/>
+        </w:rPr>
+        <w:t xml:space="preserve">Technologies: .NET, ASP.NET Core, AWS Lambda, SQS, DynamoDB, SQL Server, Vue.js</w:t>
       </w:r>
       <w:r>
         <w:rPr>
@@ -415,8 +698,8 @@
           <w:szCs w:val="26"/>
         </w:rPr>
       </w:pPr>
-      <w:bookmarkStart w:colFirst="0" w:colLast="0" w:name="_9723osvu0eim" w:id="3"/>
-      <w:bookmarkEnd w:id="3"/>
+      <w:bookmarkStart w:colFirst="0" w:colLast="0" w:name="_5ug8hlelxkpr" w:id="4"/>
+      <w:bookmarkEnd w:id="4"/>
       <w:r>
         <w:rPr>
           <w:rFonts w:ascii="Cambria" w:cs="Cambria" w:eastAsia="Cambria" w:hAnsi="Cambria"/>
@@ -424,21 +707,141 @@
           <w:szCs w:val="26"/>
           <w:rtl w:val="0"/>
         </w:rPr>
-        <w:t xml:space="preserve">Senior Software Engineer II | Alkami Technology — Plano, TX | Jul 2018 – Jan 2023</w:t>
-      </w:r>
-    </w:p>
-    <w:p>
-      <w:pPr>
-        <w:rPr>
-          <w:rFonts w:ascii="Cambria" w:cs="Cambria" w:eastAsia="Cambria" w:hAnsi="Cambria"/>
-        </w:rPr>
-      </w:pPr>
-      <w:r>
-        <w:rPr>
-          <w:rFonts w:ascii="Cambria" w:cs="Cambria" w:eastAsia="Cambria" w:hAnsi="Cambria"/>
-          <w:rtl w:val="0"/>
-        </w:rPr>
-        <w:t xml:space="preserve">Built scalable microservices and event-driven systems for digital banking platforms serving millions of users across 200+ financial institutions. Collaborated in an Agile environment to deliver high-quality features while mentoring team members on architectural best practices.</w:t>
+        <w:t xml:space="preserve">Solutions Developer III | Cottonwood Financial — Irving, TX | Feb 2015 – Jun 2018</w:t>
+      </w:r>
+    </w:p>
+    <w:p>
+      <w:pPr>
+        <w:rPr>
+          <w:rFonts w:ascii="Cambria" w:cs="Cambria" w:eastAsia="Cambria" w:hAnsi="Cambria"/>
+        </w:rPr>
+      </w:pPr>
+      <w:r>
+        <w:rPr>
+          <w:rFonts w:ascii="Cambria" w:cs="Cambria" w:eastAsia="Cambria" w:hAnsi="Cambria"/>
+          <w:rtl w:val="0"/>
+        </w:rPr>
+        <w:t xml:space="preserve">Developed enterprise applications for consumer finance operations. Led modernization initiatives to improve system architecture, enhance testability, and accelerate development velocity.</w:t>
+      </w:r>
+    </w:p>
+    <w:p>
+      <w:pPr>
+        <w:rPr>
+          <w:rFonts w:ascii="Cambria" w:cs="Cambria" w:eastAsia="Cambria" w:hAnsi="Cambria"/>
+        </w:rPr>
+      </w:pPr>
+      <w:r>
+        <w:rPr>
+          <w:rtl w:val="0"/>
+        </w:rPr>
+      </w:r>
+    </w:p>
+    <w:p>
+      <w:pPr>
+        <w:rPr>
+          <w:rFonts w:ascii="Cambria" w:cs="Cambria" w:eastAsia="Cambria" w:hAnsi="Cambria"/>
+          <w:b w:val="1"/>
+          <w:bCs w:val="1"/>
+        </w:rPr>
+      </w:pPr>
+      <w:r>
+        <w:rPr>
+          <w:rFonts w:ascii="Cambria" w:cs="Cambria" w:eastAsia="Cambria" w:hAnsi="Cambria"/>
+          <w:b w:val="1"/>
+          <w:bCs w:val="1"/>
+          <w:rtl w:val="0"/>
+        </w:rPr>
+        <w:t xml:space="preserve">Key Achievements:</w:t>
+      </w:r>
+    </w:p>
+    <w:p>
+      <w:pPr>
+        <w:numPr>
+          <w:ilvl w:val="0"/>
+          <w:numId w:val="3"/>
+        </w:numPr>
+        <w:ind w:left="720" w:hanging="360"/>
+        <w:rPr>
+          <w:rFonts w:ascii="Cambria" w:cs="Cambria" w:eastAsia="Cambria" w:hAnsi="Cambria"/>
+          <w:sz w:val="22"/>
+          <w:szCs w:val="22"/>
+        </w:rPr>
+      </w:pPr>
+      <w:r>
+        <w:rPr>
+          <w:rFonts w:ascii="Cambria" w:cs="Cambria" w:eastAsia="Cambria" w:hAnsi="Cambria"/>
+          <w:b w:val="1"/>
+          <w:bCs w:val="1"/>
+          <w:rtl w:val="0"/>
+        </w:rPr>
+        <w:t xml:space="preserve">Delivered multi-location POS system</w:t>
+      </w:r>
+      <w:r>
+        <w:rPr>
+          <w:rFonts w:ascii="Cambria" w:cs="Cambria" w:eastAsia="Cambria" w:hAnsi="Cambria"/>
+          <w:rtl w:val="0"/>
+        </w:rPr>
+        <w:t xml:space="preserve"> using WPF, deployed to hundreds of retail locations nationwide</w:t>
+      </w:r>
+    </w:p>
+    <w:p>
+      <w:pPr>
+        <w:numPr>
+          <w:ilvl w:val="0"/>
+          <w:numId w:val="3"/>
+        </w:numPr>
+        <w:ind w:left="720" w:hanging="360"/>
+        <w:rPr>
+          <w:rFonts w:ascii="Cambria" w:cs="Cambria" w:eastAsia="Cambria" w:hAnsi="Cambria"/>
+          <w:sz w:val="22"/>
+          <w:szCs w:val="22"/>
+        </w:rPr>
+      </w:pPr>
+      <w:r>
+        <w:rPr>
+          <w:rFonts w:ascii="Cambria" w:cs="Cambria" w:eastAsia="Cambria" w:hAnsi="Cambria"/>
+          <w:b w:val="1"/>
+          <w:bCs w:val="1"/>
+          <w:rtl w:val="0"/>
+        </w:rPr>
+        <w:t xml:space="preserve">Improved system scalability</w:t>
+      </w:r>
+      <w:r>
+        <w:rPr>
+          <w:rFonts w:ascii="Cambria" w:cs="Cambria" w:eastAsia="Cambria" w:hAnsi="Cambria"/>
+          <w:rtl w:val="0"/>
+        </w:rPr>
+        <w:t xml:space="preserve"> by refactoring monolithic services into modular, independently deployable components</w:t>
+      </w:r>
+    </w:p>
+    <w:p>
+      <w:pPr>
+        <w:numPr>
+          <w:ilvl w:val="0"/>
+          <w:numId w:val="3"/>
+        </w:numPr>
+        <w:ind w:left="720" w:hanging="360"/>
+        <w:rPr>
+          <w:rFonts w:ascii="Cambria" w:cs="Cambria" w:eastAsia="Cambria" w:hAnsi="Cambria"/>
+          <w:sz w:val="22"/>
+          <w:szCs w:val="22"/>
+        </w:rPr>
+      </w:pPr>
+      <w:r>
+        <w:rPr>
+          <w:rFonts w:ascii="Cambria" w:cs="Cambria" w:eastAsia="Cambria" w:hAnsi="Cambria"/>
+          <w:b w:val="1"/>
+          <w:bCs w:val="1"/>
+          <w:rtl w:val="0"/>
+        </w:rPr>
+        <w:t xml:space="preserve">Reduced QA cycle time</w:t>
+      </w:r>
+      <w:r>
+        <w:rPr>
+          <w:rFonts w:ascii="Cambria" w:cs="Cambria" w:eastAsia="Cambria" w:hAnsi="Cambria"/>
+          <w:rtl w:val="0"/>
+        </w:rPr>
+        <w:t xml:space="preserve"> by building automated testing tools and establishing testing best practices</w:t>
       </w:r>
     </w:p>
     <w:p>
@@ -477,15 +880,81 @@
       <w:r>
         <w:rPr>
           <w:rFonts w:ascii="Cambria" w:cs="Cambria" w:eastAsia="Cambria" w:hAnsi="Cambria"/>
-          <w:b w:val="1"/>
+          <w:i w:val="1"/>
+          <w:iCs w:val="1"/>
+          <w:rtl w:val="0"/>
+        </w:rPr>
+        <w:t xml:space="preserve">Technologies: .NET, ASP.NET, WCF, SQL Server, WPF, MongoDB</w:t>
+      </w:r>
+      <w:r>
+        <w:rPr>
+          <w:rtl w:val="0"/>
+        </w:rPr>
+      </w:r>
+    </w:p>
+    <w:p>
+      <w:pPr>
+        <w:pStyle w:val="Heading3"/>
+        <w:rPr>
+          <w:rFonts w:ascii="Cambria" w:cs="Cambria" w:eastAsia="Cambria" w:hAnsi="Cambria"/>
+          <w:sz w:val="26"/>
+          <w:szCs w:val="26"/>
+        </w:rPr>
+      </w:pPr>
+      <w:bookmarkStart w:colFirst="0" w:colLast="0" w:name="_svknel1ifu4j" w:id="5"/>
+      <w:bookmarkEnd w:id="5"/>
+      <w:r>
+        <w:rPr>
+          <w:rFonts w:ascii="Cambria" w:cs="Cambria" w:eastAsia="Cambria" w:hAnsi="Cambria"/>
+          <w:sz w:val="26"/>
+          <w:szCs w:val="26"/>
+          <w:rtl w:val="0"/>
+        </w:rPr>
+        <w:t xml:space="preserve">Tech Lead | DealerSpeedLeads — Dallas, TX | Mar 2011 – Feb 2015</w:t>
+      </w:r>
+    </w:p>
+    <w:p>
+      <w:pPr>
+        <w:rPr>
+          <w:rFonts w:ascii="Cambria" w:cs="Cambria" w:eastAsia="Cambria" w:hAnsi="Cambria"/>
+        </w:rPr>
+      </w:pPr>
+      <w:r>
+        <w:rPr>
+          <w:rFonts w:ascii="Cambria" w:cs="Cambria" w:eastAsia="Cambria" w:hAnsi="Cambria"/>
+          <w:rtl w:val="0"/>
+        </w:rPr>
+        <w:t xml:space="preserve">Led full-stack development for a marketing technology SaaS platform. Architected scalable solutions, built automation systems, and established development processes.</w:t>
+      </w:r>
+    </w:p>
+    <w:p>
+      <w:pPr>
+        <w:rPr>
+          <w:rFonts w:ascii="Cambria" w:cs="Cambria" w:eastAsia="Cambria" w:hAnsi="Cambria"/>
+        </w:rPr>
+      </w:pPr>
+      <w:r>
+        <w:rPr>
+          <w:rtl w:val="0"/>
+        </w:rPr>
+      </w:r>
+    </w:p>
+    <w:p>
+      <w:pPr>
+        <w:rPr>
+          <w:rFonts w:ascii="Cambria" w:cs="Cambria" w:eastAsia="Cambria" w:hAnsi="Cambria"/>
+          <w:b w:val="1"/>
+          <w:bCs w:val="1"/>
+        </w:rPr>
+      </w:pPr>
+      <w:r>
+        <w:rPr>
+          <w:rFonts w:ascii="Cambria" w:cs="Cambria" w:eastAsia="Cambria" w:hAnsi="Cambria"/>
+          <w:b w:val="1"/>
+          <w:bCs w:val="1"/>
           <w:rtl w:val="0"/>
         </w:rPr>
         <w:t xml:space="preserve">Key Achievements:</w:t>
-      </w:r>
-      <w:r>
-        <w:rPr>
-          <w:rtl w:val="0"/>
-        </w:rPr>
       </w:r>
     </w:p>
     <w:p>
@@ -495,21 +964,27 @@
           <w:numId w:val="1"/>
         </w:numPr>
         <w:ind w:left="720" w:hanging="360"/>
-      </w:pPr>
-      <w:r>
-        <w:rPr>
-          <w:rFonts w:ascii="Cambria" w:cs="Cambria" w:eastAsia="Cambria" w:hAnsi="Cambria"/>
-          <w:b w:val="1"/>
-          <w:rtl w:val="0"/>
-        </w:rPr>
-        <w:t xml:space="preserve">Pioneered serverless architecture</w:t>
-      </w:r>
-      <w:r>
-        <w:rPr>
-          <w:rFonts w:ascii="Cambria" w:cs="Cambria" w:eastAsia="Cambria" w:hAnsi="Cambria"/>
-          <w:rtl w:val="0"/>
-        </w:rPr>
-        <w:t xml:space="preserve"> by developing Alkami's first AWS Lambda-based APIs, establishing patterns for future development</w:t>
+        <w:rPr>
+          <w:rFonts w:ascii="Cambria" w:cs="Cambria" w:eastAsia="Cambria" w:hAnsi="Cambria"/>
+          <w:sz w:val="22"/>
+          <w:szCs w:val="22"/>
+        </w:rPr>
+      </w:pPr>
+      <w:r>
+        <w:rPr>
+          <w:rFonts w:ascii="Cambria" w:cs="Cambria" w:eastAsia="Cambria" w:hAnsi="Cambria"/>
+          <w:b w:val="1"/>
+          <w:bCs w:val="1"/>
+          <w:rtl w:val="0"/>
+        </w:rPr>
+        <w:t xml:space="preserve">Architected multi-tenant inventory platform</w:t>
+      </w:r>
+      <w:r>
+        <w:rPr>
+          <w:rFonts w:ascii="Cambria" w:cs="Cambria" w:eastAsia="Cambria" w:hAnsi="Cambria"/>
+          <w:rtl w:val="0"/>
+        </w:rPr>
+        <w:t xml:space="preserve"> supporting automotive, real estate, and e-commerce verticals with configurable data models</w:t>
       </w:r>
     </w:p>
     <w:p>
@@ -519,21 +994,27 @@
           <w:numId w:val="1"/>
         </w:numPr>
         <w:ind w:left="720" w:hanging="360"/>
-      </w:pPr>
-      <w:r>
-        <w:rPr>
-          <w:rFonts w:ascii="Cambria" w:cs="Cambria" w:eastAsia="Cambria" w:hAnsi="Cambria"/>
-          <w:b w:val="1"/>
-          <w:rtl w:val="0"/>
-        </w:rPr>
-        <w:t xml:space="preserve">Launched real-time notification platform</w:t>
-      </w:r>
-      <w:r>
-        <w:rPr>
-          <w:rFonts w:ascii="Cambria" w:cs="Cambria" w:eastAsia="Cambria" w:hAnsi="Cambria"/>
-          <w:rtl w:val="0"/>
-        </w:rPr>
-        <w:t xml:space="preserve"> enabling banks to deliver instant alerts to customers across web and mobile channels</w:t>
+        <w:rPr>
+          <w:rFonts w:ascii="Cambria" w:cs="Cambria" w:eastAsia="Cambria" w:hAnsi="Cambria"/>
+          <w:sz w:val="22"/>
+          <w:szCs w:val="22"/>
+        </w:rPr>
+      </w:pPr>
+      <w:r>
+        <w:rPr>
+          <w:rFonts w:ascii="Cambria" w:cs="Cambria" w:eastAsia="Cambria" w:hAnsi="Cambria"/>
+          <w:b w:val="1"/>
+          <w:bCs w:val="1"/>
+          <w:rtl w:val="0"/>
+        </w:rPr>
+        <w:t xml:space="preserve">Built distributed automation system</w:t>
+      </w:r>
+      <w:r>
+        <w:rPr>
+          <w:rFonts w:ascii="Cambria" w:cs="Cambria" w:eastAsia="Cambria" w:hAnsi="Cambria"/>
+          <w:rtl w:val="0"/>
+        </w:rPr>
+        <w:t xml:space="preserve"> processing thousands of daily operations across customer accounts</w:t>
       </w:r>
     </w:p>
     <w:p>
@@ -543,48 +1024,27 @@
           <w:numId w:val="1"/>
         </w:numPr>
         <w:ind w:left="720" w:hanging="360"/>
-      </w:pPr>
-      <w:r>
-        <w:rPr>
-          <w:rFonts w:ascii="Cambria" w:cs="Cambria" w:eastAsia="Cambria" w:hAnsi="Cambria"/>
-          <w:b w:val="1"/>
-          <w:rtl w:val="0"/>
-        </w:rPr>
-        <w:t xml:space="preserve">Elevated code quality</w:t>
-      </w:r>
-      <w:r>
-        <w:rPr>
-          <w:rFonts w:ascii="Cambria" w:cs="Cambria" w:eastAsia="Cambria" w:hAnsi="Cambria"/>
-          <w:rtl w:val="0"/>
-        </w:rPr>
-        <w:t xml:space="preserve"> through systematic code reviews and mentorship on SOLID principles and clean architecture</w:t>
-      </w:r>
-    </w:p>
-    <w:p>
-      <w:pPr>
-        <w:keepNext w:val="0"/>
-        <w:keepLines w:val="0"/>
-        <w:pageBreakBefore w:val="0"/>
-        <w:widowControl w:val="0"/>
-        <w:pBdr>
-          <w:top w:space="0" w:sz="0" w:val="nil"/>
-          <w:left w:space="0" w:sz="0" w:val="nil"/>
-          <w:bottom w:space="0" w:sz="0" w:val="nil"/>
-          <w:right w:space="0" w:sz="0" w:val="nil"/>
-          <w:between w:space="0" w:sz="0" w:val="nil"/>
-        </w:pBdr>
-        <w:shd w:fill="auto" w:val="clear"/>
-        <w:spacing w:after="0" w:before="0" w:line="276" w:lineRule="auto"/>
-        <w:ind w:left="0" w:right="0" w:firstLine="0"/>
-        <w:jc w:val="left"/>
-        <w:rPr>
-          <w:rFonts w:ascii="Cambria" w:cs="Cambria" w:eastAsia="Cambria" w:hAnsi="Cambria"/>
-        </w:rPr>
-      </w:pPr>
-      <w:r>
-        <w:rPr>
-          <w:rtl w:val="0"/>
-        </w:rPr>
+        <w:rPr>
+          <w:rFonts w:ascii="Cambria" w:cs="Cambria" w:eastAsia="Cambria" w:hAnsi="Cambria"/>
+          <w:sz w:val="22"/>
+          <w:szCs w:val="22"/>
+        </w:rPr>
+      </w:pPr>
+      <w:r>
+        <w:rPr>
+          <w:rFonts w:ascii="Cambria" w:cs="Cambria" w:eastAsia="Cambria" w:hAnsi="Cambria"/>
+          <w:b w:val="1"/>
+          <w:bCs w:val="1"/>
+          <w:rtl w:val="0"/>
+        </w:rPr>
+        <w:t xml:space="preserve">Established deployment processes</w:t>
+      </w:r>
+      <w:r>
+        <w:rPr>
+          <w:rFonts w:ascii="Cambria" w:cs="Cambria" w:eastAsia="Cambria" w:hAnsi="Cambria"/>
+          <w:rtl w:val="0"/>
+        </w:rPr>
+        <w:t xml:space="preserve"> and delivered internal tools improving developer productivity</w:t>
       </w:r>
     </w:p>
     <w:p>
@@ -597,408 +1057,7 @@
         <w:rPr>
           <w:rFonts w:ascii="Cambria" w:cs="Cambria" w:eastAsia="Cambria" w:hAnsi="Cambria"/>
           <w:i w:val="1"/>
-          <w:rtl w:val="0"/>
-        </w:rPr>
-        <w:t xml:space="preserve">Technologies: .NET, ASP.NET Core, AWS Lambda, SQS, DynamoDB, SQL Server, Vue.js</w:t>
-      </w:r>
-      <w:r>
-        <w:rPr>
-          <w:rtl w:val="0"/>
-        </w:rPr>
-      </w:r>
-    </w:p>
-    <w:p>
-      <w:pPr>
-        <w:pStyle w:val="Heading3"/>
-        <w:rPr>
-          <w:rFonts w:ascii="Cambria" w:cs="Cambria" w:eastAsia="Cambria" w:hAnsi="Cambria"/>
-          <w:sz w:val="26"/>
-          <w:szCs w:val="26"/>
-        </w:rPr>
-      </w:pPr>
-      <w:bookmarkStart w:colFirst="0" w:colLast="0" w:name="_5ug8hlelxkpr" w:id="4"/>
-      <w:bookmarkEnd w:id="4"/>
-      <w:r>
-        <w:rPr>
-          <w:rFonts w:ascii="Cambria" w:cs="Cambria" w:eastAsia="Cambria" w:hAnsi="Cambria"/>
-          <w:sz w:val="26"/>
-          <w:szCs w:val="26"/>
-          <w:rtl w:val="0"/>
-        </w:rPr>
-        <w:t xml:space="preserve">Solutions Developer III | Cottonwood Financial — Irving, TX | Feb 2015 – Jun 2018</w:t>
-      </w:r>
-    </w:p>
-    <w:p>
-      <w:pPr>
-        <w:rPr>
-          <w:rFonts w:ascii="Cambria" w:cs="Cambria" w:eastAsia="Cambria" w:hAnsi="Cambria"/>
-        </w:rPr>
-      </w:pPr>
-      <w:r>
-        <w:rPr>
-          <w:rFonts w:ascii="Cambria" w:cs="Cambria" w:eastAsia="Cambria" w:hAnsi="Cambria"/>
-          <w:rtl w:val="0"/>
-        </w:rPr>
-        <w:t xml:space="preserve">Developed enterprise applications for consumer finance operations. Led modernization initiatives to improve system architecture, enhance testability, and accelerate development velocity.</w:t>
-      </w:r>
-    </w:p>
-    <w:p>
-      <w:pPr>
-        <w:keepNext w:val="0"/>
-        <w:keepLines w:val="0"/>
-        <w:pageBreakBefore w:val="0"/>
-        <w:widowControl w:val="0"/>
-        <w:pBdr>
-          <w:top w:space="0" w:sz="0" w:val="nil"/>
-          <w:left w:space="0" w:sz="0" w:val="nil"/>
-          <w:bottom w:space="0" w:sz="0" w:val="nil"/>
-          <w:right w:space="0" w:sz="0" w:val="nil"/>
-          <w:between w:space="0" w:sz="0" w:val="nil"/>
-        </w:pBdr>
-        <w:shd w:fill="auto" w:val="clear"/>
-        <w:spacing w:after="0" w:before="0" w:line="276" w:lineRule="auto"/>
-        <w:ind w:left="0" w:right="0" w:firstLine="0"/>
-        <w:jc w:val="left"/>
-        <w:rPr>
-          <w:rFonts w:ascii="Cambria" w:cs="Cambria" w:eastAsia="Cambria" w:hAnsi="Cambria"/>
-        </w:rPr>
-      </w:pPr>
-      <w:r>
-        <w:rPr>
-          <w:rtl w:val="0"/>
-        </w:rPr>
-      </w:r>
-    </w:p>
-    <w:p>
-      <w:pPr>
-        <w:rPr>
-          <w:rFonts w:ascii="Cambria" w:cs="Cambria" w:eastAsia="Cambria" w:hAnsi="Cambria"/>
-        </w:rPr>
-      </w:pPr>
-      <w:r>
-        <w:rPr>
-          <w:rFonts w:ascii="Cambria" w:cs="Cambria" w:eastAsia="Cambria" w:hAnsi="Cambria"/>
-          <w:b w:val="1"/>
-          <w:rtl w:val="0"/>
-        </w:rPr>
-        <w:t xml:space="preserve">Key Achievements:</w:t>
-      </w:r>
-      <w:r>
-        <w:rPr>
-          <w:rtl w:val="0"/>
-        </w:rPr>
-      </w:r>
-    </w:p>
-    <w:p>
-      <w:pPr>
-        <w:numPr>
-          <w:ilvl w:val="0"/>
-          <w:numId w:val="1"/>
-        </w:numPr>
-        <w:ind w:left="720" w:hanging="360"/>
-      </w:pPr>
-      <w:r>
-        <w:rPr>
-          <w:rFonts w:ascii="Cambria" w:cs="Cambria" w:eastAsia="Cambria" w:hAnsi="Cambria"/>
-          <w:b w:val="1"/>
-          <w:rtl w:val="0"/>
-        </w:rPr>
-        <w:t xml:space="preserve">Delivered multi-location POS system</w:t>
-      </w:r>
-      <w:r>
-        <w:rPr>
-          <w:rFonts w:ascii="Cambria" w:cs="Cambria" w:eastAsia="Cambria" w:hAnsi="Cambria"/>
-          <w:rtl w:val="0"/>
-        </w:rPr>
-        <w:t xml:space="preserve"> using WPF, deployed to hundreds of retail locations nationwide</w:t>
-      </w:r>
-    </w:p>
-    <w:p>
-      <w:pPr>
-        <w:numPr>
-          <w:ilvl w:val="0"/>
-          <w:numId w:val="1"/>
-        </w:numPr>
-        <w:ind w:left="720" w:hanging="360"/>
-      </w:pPr>
-      <w:r>
-        <w:rPr>
-          <w:rFonts w:ascii="Cambria" w:cs="Cambria" w:eastAsia="Cambria" w:hAnsi="Cambria"/>
-          <w:b w:val="1"/>
-          <w:rtl w:val="0"/>
-        </w:rPr>
-        <w:t xml:space="preserve">Improved system scalability</w:t>
-      </w:r>
-      <w:r>
-        <w:rPr>
-          <w:rFonts w:ascii="Cambria" w:cs="Cambria" w:eastAsia="Cambria" w:hAnsi="Cambria"/>
-          <w:rtl w:val="0"/>
-        </w:rPr>
-        <w:t xml:space="preserve"> by refactoring monolithic services into modular, independently deployable components</w:t>
-      </w:r>
-    </w:p>
-    <w:p>
-      <w:pPr>
-        <w:numPr>
-          <w:ilvl w:val="0"/>
-          <w:numId w:val="1"/>
-        </w:numPr>
-        <w:ind w:left="720" w:hanging="360"/>
-      </w:pPr>
-      <w:r>
-        <w:rPr>
-          <w:rFonts w:ascii="Cambria" w:cs="Cambria" w:eastAsia="Cambria" w:hAnsi="Cambria"/>
-          <w:b w:val="1"/>
-          <w:rtl w:val="0"/>
-        </w:rPr>
-        <w:t xml:space="preserve">Reduced QA cycle time</w:t>
-      </w:r>
-      <w:r>
-        <w:rPr>
-          <w:rFonts w:ascii="Cambria" w:cs="Cambria" w:eastAsia="Cambria" w:hAnsi="Cambria"/>
-          <w:rtl w:val="0"/>
-        </w:rPr>
-        <w:t xml:space="preserve"> by building automated testing tools and establishing testing best practices</w:t>
-      </w:r>
-    </w:p>
-    <w:p>
-      <w:pPr>
-        <w:keepNext w:val="0"/>
-        <w:keepLines w:val="0"/>
-        <w:pageBreakBefore w:val="0"/>
-        <w:widowControl w:val="0"/>
-        <w:pBdr>
-          <w:top w:space="0" w:sz="0" w:val="nil"/>
-          <w:left w:space="0" w:sz="0" w:val="nil"/>
-          <w:bottom w:space="0" w:sz="0" w:val="nil"/>
-          <w:right w:space="0" w:sz="0" w:val="nil"/>
-          <w:between w:space="0" w:sz="0" w:val="nil"/>
-        </w:pBdr>
-        <w:shd w:fill="auto" w:val="clear"/>
-        <w:spacing w:after="0" w:before="0" w:line="276" w:lineRule="auto"/>
-        <w:ind w:left="0" w:right="0" w:firstLine="0"/>
-        <w:jc w:val="left"/>
-        <w:rPr>
-          <w:rFonts w:ascii="Cambria" w:cs="Cambria" w:eastAsia="Cambria" w:hAnsi="Cambria"/>
-        </w:rPr>
-      </w:pPr>
-      <w:r>
-        <w:rPr>
-          <w:rtl w:val="0"/>
-        </w:rPr>
-      </w:r>
-    </w:p>
-    <w:p>
-      <w:pPr>
-        <w:rPr>
-          <w:rFonts w:ascii="Cambria" w:cs="Cambria" w:eastAsia="Cambria" w:hAnsi="Cambria"/>
-        </w:rPr>
-      </w:pPr>
-      <w:r>
-        <w:rPr>
-          <w:rFonts w:ascii="Cambria" w:cs="Cambria" w:eastAsia="Cambria" w:hAnsi="Cambria"/>
-          <w:i w:val="1"/>
-          <w:rtl w:val="0"/>
-        </w:rPr>
-        <w:t xml:space="preserve">Technologies: .NET, ASP.NET, WCF, SQL Server, WPF, MongoDB</w:t>
-      </w:r>
-      <w:r>
-        <w:rPr>
-          <w:rtl w:val="0"/>
-        </w:rPr>
-      </w:r>
-    </w:p>
-    <w:p>
-      <w:pPr>
-        <w:pStyle w:val="Heading3"/>
-        <w:rPr>
-          <w:rFonts w:ascii="Cambria" w:cs="Cambria" w:eastAsia="Cambria" w:hAnsi="Cambria"/>
-          <w:sz w:val="26"/>
-          <w:szCs w:val="26"/>
-        </w:rPr>
-      </w:pPr>
-      <w:bookmarkStart w:colFirst="0" w:colLast="0" w:name="_svknel1ifu4j" w:id="5"/>
-      <w:bookmarkEnd w:id="5"/>
-      <w:r>
-        <w:rPr>
-          <w:rFonts w:ascii="Cambria" w:cs="Cambria" w:eastAsia="Cambria" w:hAnsi="Cambria"/>
-          <w:sz w:val="26"/>
-          <w:szCs w:val="26"/>
-          <w:rtl w:val="0"/>
-        </w:rPr>
-        <w:t xml:space="preserve">Tech Lead | DealerSpeedLeads — Dallas, TX | Mar 2011 – Feb 2015</w:t>
-      </w:r>
-    </w:p>
-    <w:p>
-      <w:pPr>
-        <w:rPr>
-          <w:rFonts w:ascii="Cambria" w:cs="Cambria" w:eastAsia="Cambria" w:hAnsi="Cambria"/>
-        </w:rPr>
-      </w:pPr>
-      <w:r>
-        <w:rPr>
-          <w:rFonts w:ascii="Cambria" w:cs="Cambria" w:eastAsia="Cambria" w:hAnsi="Cambria"/>
-          <w:rtl w:val="0"/>
-        </w:rPr>
-        <w:t xml:space="preserve">Led full-stack development for marketing technology SaaS platform. Architected scalable solutions, built automation systems, and delivered customer-facing applications while establishing development processes.</w:t>
-      </w:r>
-    </w:p>
-    <w:p>
-      <w:pPr>
-        <w:keepNext w:val="0"/>
-        <w:keepLines w:val="0"/>
-        <w:pageBreakBefore w:val="0"/>
-        <w:widowControl w:val="0"/>
-        <w:pBdr>
-          <w:top w:space="0" w:sz="0" w:val="nil"/>
-          <w:left w:space="0" w:sz="0" w:val="nil"/>
-          <w:bottom w:space="0" w:sz="0" w:val="nil"/>
-          <w:right w:space="0" w:sz="0" w:val="nil"/>
-          <w:between w:space="0" w:sz="0" w:val="nil"/>
-        </w:pBdr>
-        <w:shd w:fill="auto" w:val="clear"/>
-        <w:spacing w:after="0" w:before="0" w:line="276" w:lineRule="auto"/>
-        <w:ind w:left="0" w:right="0" w:firstLine="0"/>
-        <w:jc w:val="left"/>
-        <w:rPr>
-          <w:rFonts w:ascii="Cambria" w:cs="Cambria" w:eastAsia="Cambria" w:hAnsi="Cambria"/>
-        </w:rPr>
-      </w:pPr>
-      <w:r>
-        <w:rPr>
-          <w:rtl w:val="0"/>
-        </w:rPr>
-      </w:r>
-    </w:p>
-    <w:p>
-      <w:pPr>
-        <w:rPr>
-          <w:rFonts w:ascii="Cambria" w:cs="Cambria" w:eastAsia="Cambria" w:hAnsi="Cambria"/>
-        </w:rPr>
-      </w:pPr>
-      <w:r>
-        <w:rPr>
-          <w:rFonts w:ascii="Cambria" w:cs="Cambria" w:eastAsia="Cambria" w:hAnsi="Cambria"/>
-          <w:b w:val="1"/>
-          <w:rtl w:val="0"/>
-        </w:rPr>
-        <w:t xml:space="preserve">Key Achievements:</w:t>
-      </w:r>
-      <w:r>
-        <w:rPr>
-          <w:rtl w:val="0"/>
-        </w:rPr>
-      </w:r>
-    </w:p>
-    <w:p>
-      <w:pPr>
-        <w:numPr>
-          <w:ilvl w:val="0"/>
-          <w:numId w:val="1"/>
-        </w:numPr>
-        <w:ind w:left="720" w:hanging="360"/>
-      </w:pPr>
-      <w:r>
-        <w:rPr>
-          <w:rFonts w:ascii="Cambria" w:cs="Cambria" w:eastAsia="Cambria" w:hAnsi="Cambria"/>
-          <w:b w:val="1"/>
-          <w:rtl w:val="0"/>
-        </w:rPr>
-        <w:t xml:space="preserve">Architected multi-tenant inventory platform</w:t>
-      </w:r>
-      <w:r>
-        <w:rPr>
-          <w:rFonts w:ascii="Cambria" w:cs="Cambria" w:eastAsia="Cambria" w:hAnsi="Cambria"/>
-          <w:rtl w:val="0"/>
-        </w:rPr>
-        <w:t xml:space="preserve"> supporting automotive, real estate, and e-commerce verticals with configurable data models</w:t>
-      </w:r>
-    </w:p>
-    <w:p>
-      <w:pPr>
-        <w:numPr>
-          <w:ilvl w:val="0"/>
-          <w:numId w:val="1"/>
-        </w:numPr>
-        <w:ind w:left="720" w:hanging="360"/>
-      </w:pPr>
-      <w:r>
-        <w:rPr>
-          <w:rFonts w:ascii="Cambria" w:cs="Cambria" w:eastAsia="Cambria" w:hAnsi="Cambria"/>
-          <w:b w:val="1"/>
-          <w:rtl w:val="0"/>
-        </w:rPr>
-        <w:t xml:space="preserve">Built distributed automation system</w:t>
-      </w:r>
-      <w:r>
-        <w:rPr>
-          <w:rFonts w:ascii="Cambria" w:cs="Cambria" w:eastAsia="Cambria" w:hAnsi="Cambria"/>
-          <w:rtl w:val="0"/>
-        </w:rPr>
-        <w:t xml:space="preserve"> processing thousands of daily operations across customer accounts</w:t>
-      </w:r>
-    </w:p>
-    <w:p>
-      <w:pPr>
-        <w:numPr>
-          <w:ilvl w:val="0"/>
-          <w:numId w:val="1"/>
-        </w:numPr>
-        <w:ind w:left="720" w:hanging="360"/>
-      </w:pPr>
-      <w:r>
-        <w:rPr>
-          <w:rFonts w:ascii="Cambria" w:cs="Cambria" w:eastAsia="Cambria" w:hAnsi="Cambria"/>
-          <w:b w:val="1"/>
-          <w:rtl w:val="0"/>
-        </w:rPr>
-        <w:t xml:space="preserve">Established deployment processes</w:t>
-      </w:r>
-      <w:r>
-        <w:rPr>
-          <w:rFonts w:ascii="Cambria" w:cs="Cambria" w:eastAsia="Cambria" w:hAnsi="Cambria"/>
-          <w:rtl w:val="0"/>
-        </w:rPr>
-        <w:t xml:space="preserve"> and delivered internal tools improving developer productivity</w:t>
-      </w:r>
-    </w:p>
-    <w:p>
-      <w:pPr>
-        <w:keepNext w:val="0"/>
-        <w:keepLines w:val="0"/>
-        <w:pageBreakBefore w:val="0"/>
-        <w:widowControl w:val="0"/>
-        <w:pBdr>
-          <w:top w:space="0" w:sz="0" w:val="nil"/>
-          <w:left w:space="0" w:sz="0" w:val="nil"/>
-          <w:bottom w:space="0" w:sz="0" w:val="nil"/>
-          <w:right w:space="0" w:sz="0" w:val="nil"/>
-          <w:between w:space="0" w:sz="0" w:val="nil"/>
-        </w:pBdr>
-        <w:shd w:fill="auto" w:val="clear"/>
-        <w:spacing w:after="0" w:before="0" w:line="276" w:lineRule="auto"/>
-        <w:ind w:left="0" w:right="0" w:firstLine="0"/>
-        <w:jc w:val="left"/>
-        <w:rPr>
-          <w:rFonts w:ascii="Cambria" w:cs="Cambria" w:eastAsia="Cambria" w:hAnsi="Cambria"/>
-        </w:rPr>
-      </w:pPr>
-      <w:r>
-        <w:rPr>
-          <w:rtl w:val="0"/>
-        </w:rPr>
-      </w:r>
-    </w:p>
-    <w:p>
-      <w:pPr>
-        <w:rPr>
-          <w:rFonts w:ascii="Cambria" w:cs="Cambria" w:eastAsia="Cambria" w:hAnsi="Cambria"/>
-        </w:rPr>
-      </w:pPr>
-      <w:r>
-        <w:rPr>
-          <w:rFonts w:ascii="Cambria" w:cs="Cambria" w:eastAsia="Cambria" w:hAnsi="Cambria"/>
-          <w:i w:val="1"/>
+          <w:iCs w:val="1"/>
           <w:rtl w:val="0"/>
         </w:rPr>
         <w:t xml:space="preserve">Technologies: .NET, ASP.NET, MySQL, WPF, WinForms, Selenium</w:t>
@@ -1040,6 +1099,7 @@
         <w:rPr>
           <w:rFonts w:ascii="Cambria" w:cs="Cambria" w:eastAsia="Cambria" w:hAnsi="Cambria"/>
           <w:b w:val="1"/>
+          <w:bCs w:val="1"/>
           <w:rtl w:val="0"/>
         </w:rPr>
         <w:t xml:space="preserve">B.S., Computer Information Systems</w:t>
@@ -1067,204 +1127,469 @@
     <w:lvl w:ilvl="0">
       <w:start w:val="1"/>
       <w:numFmt w:val="bullet"/>
-      <w:lvlText w:val="-"/>
+      <w:lvlText w:val="●"/>
       <w:lvlJc w:val="left"/>
       <w:pPr>
         <w:ind w:left="720" w:hanging="360"/>
       </w:pPr>
       <w:rPr>
-        <w:rFonts w:ascii="Arial" w:cs="Arial" w:eastAsia="Arial" w:hAnsi="Arial"/>
-        <w:b w:val="0"/>
-        <w:i w:val="0"/>
-        <w:smallCaps w:val="0"/>
-        <w:strike w:val="0"/>
-        <w:color w:val="000000"/>
-        <w:sz w:val="22"/>
-        <w:szCs w:val="22"/>
-        <w:u w:val="none"/>
-        <w:shd w:fill="auto" w:val="clear"/>
-        <w:vertAlign w:val="baseline"/>
+        <w:rFonts w:ascii="Roboto" w:cs="Roboto" w:eastAsia="Roboto" w:hAnsi="Roboto"/>
+        <w:color w:val="2c3e50"/>
+        <w:sz w:val="24"/>
+        <w:szCs w:val="24"/>
+        <w:u w:val="none"/>
       </w:rPr>
     </w:lvl>
     <w:lvl w:ilvl="1">
       <w:start w:val="1"/>
       <w:numFmt w:val="bullet"/>
-      <w:lvlText w:val="-"/>
+      <w:lvlText w:val="○"/>
       <w:lvlJc w:val="left"/>
       <w:pPr>
         <w:ind w:left="1440" w:hanging="360"/>
       </w:pPr>
       <w:rPr>
-        <w:rFonts w:ascii="Arial" w:cs="Arial" w:eastAsia="Arial" w:hAnsi="Arial"/>
-        <w:b w:val="0"/>
-        <w:i w:val="0"/>
-        <w:smallCaps w:val="0"/>
-        <w:strike w:val="0"/>
-        <w:color w:val="000000"/>
-        <w:sz w:val="22"/>
-        <w:szCs w:val="22"/>
-        <w:u w:val="none"/>
-        <w:shd w:fill="auto" w:val="clear"/>
-        <w:vertAlign w:val="baseline"/>
+        <w:u w:val="none"/>
       </w:rPr>
     </w:lvl>
     <w:lvl w:ilvl="2">
       <w:start w:val="1"/>
       <w:numFmt w:val="bullet"/>
-      <w:lvlText w:val="-"/>
+      <w:lvlText w:val="■"/>
       <w:lvlJc w:val="left"/>
       <w:pPr>
         <w:ind w:left="2160" w:hanging="360"/>
       </w:pPr>
       <w:rPr>
-        <w:rFonts w:ascii="Arial" w:cs="Arial" w:eastAsia="Arial" w:hAnsi="Arial"/>
-        <w:b w:val="0"/>
-        <w:i w:val="0"/>
-        <w:smallCaps w:val="0"/>
-        <w:strike w:val="0"/>
-        <w:color w:val="000000"/>
-        <w:sz w:val="22"/>
-        <w:szCs w:val="22"/>
-        <w:u w:val="none"/>
-        <w:shd w:fill="auto" w:val="clear"/>
-        <w:vertAlign w:val="baseline"/>
+        <w:u w:val="none"/>
       </w:rPr>
     </w:lvl>
     <w:lvl w:ilvl="3">
       <w:start w:val="1"/>
       <w:numFmt w:val="bullet"/>
-      <w:lvlText w:val="-"/>
+      <w:lvlText w:val="●"/>
       <w:lvlJc w:val="left"/>
       <w:pPr>
         <w:ind w:left="2880" w:hanging="360"/>
       </w:pPr>
       <w:rPr>
-        <w:rFonts w:ascii="Arial" w:cs="Arial" w:eastAsia="Arial" w:hAnsi="Arial"/>
-        <w:b w:val="0"/>
-        <w:i w:val="0"/>
-        <w:smallCaps w:val="0"/>
-        <w:strike w:val="0"/>
-        <w:color w:val="000000"/>
-        <w:sz w:val="22"/>
-        <w:szCs w:val="22"/>
-        <w:u w:val="none"/>
-        <w:shd w:fill="auto" w:val="clear"/>
-        <w:vertAlign w:val="baseline"/>
+        <w:u w:val="none"/>
       </w:rPr>
     </w:lvl>
     <w:lvl w:ilvl="4">
       <w:start w:val="1"/>
       <w:numFmt w:val="bullet"/>
-      <w:lvlText w:val="-"/>
+      <w:lvlText w:val="○"/>
       <w:lvlJc w:val="left"/>
       <w:pPr>
         <w:ind w:left="3600" w:hanging="360"/>
       </w:pPr>
       <w:rPr>
-        <w:rFonts w:ascii="Arial" w:cs="Arial" w:eastAsia="Arial" w:hAnsi="Arial"/>
-        <w:b w:val="0"/>
-        <w:i w:val="0"/>
-        <w:smallCaps w:val="0"/>
-        <w:strike w:val="0"/>
-        <w:color w:val="000000"/>
-        <w:sz w:val="22"/>
-        <w:szCs w:val="22"/>
-        <w:u w:val="none"/>
-        <w:shd w:fill="auto" w:val="clear"/>
-        <w:vertAlign w:val="baseline"/>
+        <w:u w:val="none"/>
       </w:rPr>
     </w:lvl>
     <w:lvl w:ilvl="5">
       <w:start w:val="1"/>
       <w:numFmt w:val="bullet"/>
-      <w:lvlText w:val="-"/>
+      <w:lvlText w:val="■"/>
       <w:lvlJc w:val="left"/>
       <w:pPr>
         <w:ind w:left="4320" w:hanging="360"/>
       </w:pPr>
       <w:rPr>
-        <w:rFonts w:ascii="Arial" w:cs="Arial" w:eastAsia="Arial" w:hAnsi="Arial"/>
-        <w:b w:val="0"/>
-        <w:i w:val="0"/>
-        <w:smallCaps w:val="0"/>
-        <w:strike w:val="0"/>
-        <w:color w:val="000000"/>
-        <w:sz w:val="22"/>
-        <w:szCs w:val="22"/>
-        <w:u w:val="none"/>
-        <w:shd w:fill="auto" w:val="clear"/>
-        <w:vertAlign w:val="baseline"/>
+        <w:u w:val="none"/>
       </w:rPr>
     </w:lvl>
     <w:lvl w:ilvl="6">
       <w:start w:val="1"/>
       <w:numFmt w:val="bullet"/>
-      <w:lvlText w:val="-"/>
+      <w:lvlText w:val="●"/>
       <w:lvlJc w:val="left"/>
       <w:pPr>
         <w:ind w:left="5040" w:hanging="360"/>
       </w:pPr>
       <w:rPr>
-        <w:rFonts w:ascii="Arial" w:cs="Arial" w:eastAsia="Arial" w:hAnsi="Arial"/>
-        <w:b w:val="0"/>
-        <w:i w:val="0"/>
-        <w:smallCaps w:val="0"/>
-        <w:strike w:val="0"/>
-        <w:color w:val="000000"/>
-        <w:sz w:val="22"/>
-        <w:szCs w:val="22"/>
-        <w:u w:val="none"/>
-        <w:shd w:fill="auto" w:val="clear"/>
-        <w:vertAlign w:val="baseline"/>
+        <w:u w:val="none"/>
       </w:rPr>
     </w:lvl>
     <w:lvl w:ilvl="7">
       <w:start w:val="1"/>
       <w:numFmt w:val="bullet"/>
-      <w:lvlText w:val="-"/>
+      <w:lvlText w:val="○"/>
       <w:lvlJc w:val="left"/>
       <w:pPr>
         <w:ind w:left="5760" w:hanging="360"/>
       </w:pPr>
       <w:rPr>
-        <w:rFonts w:ascii="Arial" w:cs="Arial" w:eastAsia="Arial" w:hAnsi="Arial"/>
-        <w:b w:val="0"/>
-        <w:i w:val="0"/>
-        <w:smallCaps w:val="0"/>
-        <w:strike w:val="0"/>
-        <w:color w:val="000000"/>
-        <w:sz w:val="22"/>
-        <w:szCs w:val="22"/>
-        <w:u w:val="none"/>
-        <w:shd w:fill="auto" w:val="clear"/>
-        <w:vertAlign w:val="baseline"/>
+        <w:u w:val="none"/>
       </w:rPr>
     </w:lvl>
     <w:lvl w:ilvl="8">
       <w:start w:val="1"/>
       <w:numFmt w:val="bullet"/>
-      <w:lvlText w:val="-"/>
+      <w:lvlText w:val="■"/>
       <w:lvlJc w:val="left"/>
       <w:pPr>
         <w:ind w:left="6480" w:hanging="360"/>
       </w:pPr>
       <w:rPr>
-        <w:rFonts w:ascii="Arial" w:cs="Arial" w:eastAsia="Arial" w:hAnsi="Arial"/>
-        <w:b w:val="0"/>
-        <w:i w:val="0"/>
-        <w:smallCaps w:val="0"/>
-        <w:strike w:val="0"/>
-        <w:color w:val="000000"/>
-        <w:sz w:val="22"/>
-        <w:szCs w:val="22"/>
-        <w:u w:val="none"/>
-        <w:shd w:fill="auto" w:val="clear"/>
-        <w:vertAlign w:val="baseline"/>
+        <w:u w:val="none"/>
+      </w:rPr>
+    </w:lvl>
+  </w:abstractNum>
+  <w:abstractNum w:abstractNumId="2">
+    <w:lvl w:ilvl="0">
+      <w:start w:val="1"/>
+      <w:numFmt w:val="bullet"/>
+      <w:lvlText w:val="●"/>
+      <w:lvlJc w:val="left"/>
+      <w:pPr>
+        <w:ind w:left="720" w:hanging="360"/>
+      </w:pPr>
+      <w:rPr>
+        <w:rFonts w:ascii="Roboto" w:cs="Roboto" w:eastAsia="Roboto" w:hAnsi="Roboto"/>
+        <w:color w:val="2c3e50"/>
+        <w:sz w:val="24"/>
+        <w:szCs w:val="24"/>
+        <w:u w:val="none"/>
+      </w:rPr>
+    </w:lvl>
+    <w:lvl w:ilvl="1">
+      <w:start w:val="1"/>
+      <w:numFmt w:val="bullet"/>
+      <w:lvlText w:val="○"/>
+      <w:lvlJc w:val="left"/>
+      <w:pPr>
+        <w:ind w:left="1440" w:hanging="360"/>
+      </w:pPr>
+      <w:rPr>
+        <w:u w:val="none"/>
+      </w:rPr>
+    </w:lvl>
+    <w:lvl w:ilvl="2">
+      <w:start w:val="1"/>
+      <w:numFmt w:val="bullet"/>
+      <w:lvlText w:val="■"/>
+      <w:lvlJc w:val="left"/>
+      <w:pPr>
+        <w:ind w:left="2160" w:hanging="360"/>
+      </w:pPr>
+      <w:rPr>
+        <w:u w:val="none"/>
+      </w:rPr>
+    </w:lvl>
+    <w:lvl w:ilvl="3">
+      <w:start w:val="1"/>
+      <w:numFmt w:val="bullet"/>
+      <w:lvlText w:val="●"/>
+      <w:lvlJc w:val="left"/>
+      <w:pPr>
+        <w:ind w:left="2880" w:hanging="360"/>
+      </w:pPr>
+      <w:rPr>
+        <w:u w:val="none"/>
+      </w:rPr>
+    </w:lvl>
+    <w:lvl w:ilvl="4">
+      <w:start w:val="1"/>
+      <w:numFmt w:val="bullet"/>
+      <w:lvlText w:val="○"/>
+      <w:lvlJc w:val="left"/>
+      <w:pPr>
+        <w:ind w:left="3600" w:hanging="360"/>
+      </w:pPr>
+      <w:rPr>
+        <w:u w:val="none"/>
+      </w:rPr>
+    </w:lvl>
+    <w:lvl w:ilvl="5">
+      <w:start w:val="1"/>
+      <w:numFmt w:val="bullet"/>
+      <w:lvlText w:val="■"/>
+      <w:lvlJc w:val="left"/>
+      <w:pPr>
+        <w:ind w:left="4320" w:hanging="360"/>
+      </w:pPr>
+      <w:rPr>
+        <w:u w:val="none"/>
+      </w:rPr>
+    </w:lvl>
+    <w:lvl w:ilvl="6">
+      <w:start w:val="1"/>
+      <w:numFmt w:val="bullet"/>
+      <w:lvlText w:val="●"/>
+      <w:lvlJc w:val="left"/>
+      <w:pPr>
+        <w:ind w:left="5040" w:hanging="360"/>
+      </w:pPr>
+      <w:rPr>
+        <w:u w:val="none"/>
+      </w:rPr>
+    </w:lvl>
+    <w:lvl w:ilvl="7">
+      <w:start w:val="1"/>
+      <w:numFmt w:val="bullet"/>
+      <w:lvlText w:val="○"/>
+      <w:lvlJc w:val="left"/>
+      <w:pPr>
+        <w:ind w:left="5760" w:hanging="360"/>
+      </w:pPr>
+      <w:rPr>
+        <w:u w:val="none"/>
+      </w:rPr>
+    </w:lvl>
+    <w:lvl w:ilvl="8">
+      <w:start w:val="1"/>
+      <w:numFmt w:val="bullet"/>
+      <w:lvlText w:val="■"/>
+      <w:lvlJc w:val="left"/>
+      <w:pPr>
+        <w:ind w:left="6480" w:hanging="360"/>
+      </w:pPr>
+      <w:rPr>
+        <w:u w:val="none"/>
+      </w:rPr>
+    </w:lvl>
+  </w:abstractNum>
+  <w:abstractNum w:abstractNumId="3">
+    <w:lvl w:ilvl="0">
+      <w:start w:val="1"/>
+      <w:numFmt w:val="bullet"/>
+      <w:lvlText w:val="●"/>
+      <w:lvlJc w:val="left"/>
+      <w:pPr>
+        <w:ind w:left="720" w:hanging="360"/>
+      </w:pPr>
+      <w:rPr>
+        <w:rFonts w:ascii="Roboto" w:cs="Roboto" w:eastAsia="Roboto" w:hAnsi="Roboto"/>
+        <w:color w:val="2c3e50"/>
+        <w:sz w:val="24"/>
+        <w:szCs w:val="24"/>
+        <w:u w:val="none"/>
+      </w:rPr>
+    </w:lvl>
+    <w:lvl w:ilvl="1">
+      <w:start w:val="1"/>
+      <w:numFmt w:val="bullet"/>
+      <w:lvlText w:val="○"/>
+      <w:lvlJc w:val="left"/>
+      <w:pPr>
+        <w:ind w:left="1440" w:hanging="360"/>
+      </w:pPr>
+      <w:rPr>
+        <w:u w:val="none"/>
+      </w:rPr>
+    </w:lvl>
+    <w:lvl w:ilvl="2">
+      <w:start w:val="1"/>
+      <w:numFmt w:val="bullet"/>
+      <w:lvlText w:val="■"/>
+      <w:lvlJc w:val="left"/>
+      <w:pPr>
+        <w:ind w:left="2160" w:hanging="360"/>
+      </w:pPr>
+      <w:rPr>
+        <w:u w:val="none"/>
+      </w:rPr>
+    </w:lvl>
+    <w:lvl w:ilvl="3">
+      <w:start w:val="1"/>
+      <w:numFmt w:val="bullet"/>
+      <w:lvlText w:val="●"/>
+      <w:lvlJc w:val="left"/>
+      <w:pPr>
+        <w:ind w:left="2880" w:hanging="360"/>
+      </w:pPr>
+      <w:rPr>
+        <w:u w:val="none"/>
+      </w:rPr>
+    </w:lvl>
+    <w:lvl w:ilvl="4">
+      <w:start w:val="1"/>
+      <w:numFmt w:val="bullet"/>
+      <w:lvlText w:val="○"/>
+      <w:lvlJc w:val="left"/>
+      <w:pPr>
+        <w:ind w:left="3600" w:hanging="360"/>
+      </w:pPr>
+      <w:rPr>
+        <w:u w:val="none"/>
+      </w:rPr>
+    </w:lvl>
+    <w:lvl w:ilvl="5">
+      <w:start w:val="1"/>
+      <w:numFmt w:val="bullet"/>
+      <w:lvlText w:val="■"/>
+      <w:lvlJc w:val="left"/>
+      <w:pPr>
+        <w:ind w:left="4320" w:hanging="360"/>
+      </w:pPr>
+      <w:rPr>
+        <w:u w:val="none"/>
+      </w:rPr>
+    </w:lvl>
+    <w:lvl w:ilvl="6">
+      <w:start w:val="1"/>
+      <w:numFmt w:val="bullet"/>
+      <w:lvlText w:val="●"/>
+      <w:lvlJc w:val="left"/>
+      <w:pPr>
+        <w:ind w:left="5040" w:hanging="360"/>
+      </w:pPr>
+      <w:rPr>
+        <w:u w:val="none"/>
+      </w:rPr>
+    </w:lvl>
+    <w:lvl w:ilvl="7">
+      <w:start w:val="1"/>
+      <w:numFmt w:val="bullet"/>
+      <w:lvlText w:val="○"/>
+      <w:lvlJc w:val="left"/>
+      <w:pPr>
+        <w:ind w:left="5760" w:hanging="360"/>
+      </w:pPr>
+      <w:rPr>
+        <w:u w:val="none"/>
+      </w:rPr>
+    </w:lvl>
+    <w:lvl w:ilvl="8">
+      <w:start w:val="1"/>
+      <w:numFmt w:val="bullet"/>
+      <w:lvlText w:val="■"/>
+      <w:lvlJc w:val="left"/>
+      <w:pPr>
+        <w:ind w:left="6480" w:hanging="360"/>
+      </w:pPr>
+      <w:rPr>
+        <w:u w:val="none"/>
+      </w:rPr>
+    </w:lvl>
+  </w:abstractNum>
+  <w:abstractNum w:abstractNumId="4">
+    <w:lvl w:ilvl="0">
+      <w:start w:val="1"/>
+      <w:numFmt w:val="bullet"/>
+      <w:lvlText w:val="●"/>
+      <w:lvlJc w:val="left"/>
+      <w:pPr>
+        <w:ind w:left="720" w:hanging="360"/>
+      </w:pPr>
+      <w:rPr>
+        <w:rFonts w:ascii="Roboto" w:cs="Roboto" w:eastAsia="Roboto" w:hAnsi="Roboto"/>
+        <w:color w:val="2c3e50"/>
+        <w:sz w:val="24"/>
+        <w:szCs w:val="24"/>
+        <w:u w:val="none"/>
+      </w:rPr>
+    </w:lvl>
+    <w:lvl w:ilvl="1">
+      <w:start w:val="1"/>
+      <w:numFmt w:val="bullet"/>
+      <w:lvlText w:val="○"/>
+      <w:lvlJc w:val="left"/>
+      <w:pPr>
+        <w:ind w:left="1440" w:hanging="360"/>
+      </w:pPr>
+      <w:rPr>
+        <w:u w:val="none"/>
+      </w:rPr>
+    </w:lvl>
+    <w:lvl w:ilvl="2">
+      <w:start w:val="1"/>
+      <w:numFmt w:val="bullet"/>
+      <w:lvlText w:val="■"/>
+      <w:lvlJc w:val="left"/>
+      <w:pPr>
+        <w:ind w:left="2160" w:hanging="360"/>
+      </w:pPr>
+      <w:rPr>
+        <w:u w:val="none"/>
+      </w:rPr>
+    </w:lvl>
+    <w:lvl w:ilvl="3">
+      <w:start w:val="1"/>
+      <w:numFmt w:val="bullet"/>
+      <w:lvlText w:val="●"/>
+      <w:lvlJc w:val="left"/>
+      <w:pPr>
+        <w:ind w:left="2880" w:hanging="360"/>
+      </w:pPr>
+      <w:rPr>
+        <w:u w:val="none"/>
+      </w:rPr>
+    </w:lvl>
+    <w:lvl w:ilvl="4">
+      <w:start w:val="1"/>
+      <w:numFmt w:val="bullet"/>
+      <w:lvlText w:val="○"/>
+      <w:lvlJc w:val="left"/>
+      <w:pPr>
+        <w:ind w:left="3600" w:hanging="360"/>
+      </w:pPr>
+      <w:rPr>
+        <w:u w:val="none"/>
+      </w:rPr>
+    </w:lvl>
+    <w:lvl w:ilvl="5">
+      <w:start w:val="1"/>
+      <w:numFmt w:val="bullet"/>
+      <w:lvlText w:val="■"/>
+      <w:lvlJc w:val="left"/>
+      <w:pPr>
+        <w:ind w:left="4320" w:hanging="360"/>
+      </w:pPr>
+      <w:rPr>
+        <w:u w:val="none"/>
+      </w:rPr>
+    </w:lvl>
+    <w:lvl w:ilvl="6">
+      <w:start w:val="1"/>
+      <w:numFmt w:val="bullet"/>
+      <w:lvlText w:val="●"/>
+      <w:lvlJc w:val="left"/>
+      <w:pPr>
+        <w:ind w:left="5040" w:hanging="360"/>
+      </w:pPr>
+      <w:rPr>
+        <w:u w:val="none"/>
+      </w:rPr>
+    </w:lvl>
+    <w:lvl w:ilvl="7">
+      <w:start w:val="1"/>
+      <w:numFmt w:val="bullet"/>
+      <w:lvlText w:val="○"/>
+      <w:lvlJc w:val="left"/>
+      <w:pPr>
+        <w:ind w:left="5760" w:hanging="360"/>
+      </w:pPr>
+      <w:rPr>
+        <w:u w:val="none"/>
+      </w:rPr>
+    </w:lvl>
+    <w:lvl w:ilvl="8">
+      <w:start w:val="1"/>
+      <w:numFmt w:val="bullet"/>
+      <w:lvlText w:val="■"/>
+      <w:lvlJc w:val="left"/>
+      <w:pPr>
+        <w:ind w:left="6480" w:hanging="360"/>
+      </w:pPr>
+      <w:rPr>
+        <w:u w:val="none"/>
       </w:rPr>
     </w:lvl>
   </w:abstractNum>
   <w:num w:numId="1">
     <w:abstractNumId w:val="1"/>
+  </w:num>
+  <w:num w:numId="2">
+    <w:abstractNumId w:val="2"/>
+  </w:num>
+  <w:num w:numId="3">
+    <w:abstractNumId w:val="3"/>
+  </w:num>
+  <w:num w:numId="4">
+    <w:abstractNumId w:val="4"/>
   </w:num>
 </w:numbering>
 </file>
@@ -1326,6 +1651,7 @@
     </w:pPr>
     <w:rPr>
       <w:b w:val="0"/>
+      <w:bCs w:val="0"/>
       <w:sz w:val="32"/>
       <w:szCs w:val="32"/>
     </w:rPr>
@@ -1342,6 +1668,7 @@
     </w:pPr>
     <w:rPr>
       <w:b w:val="0"/>
+      <w:bCs w:val="0"/>
       <w:color w:val="434343"/>
       <w:sz w:val="28"/>
       <w:szCs w:val="28"/>
@@ -1391,6 +1718,7 @@
     </w:pPr>
     <w:rPr>
       <w:i w:val="1"/>
+      <w:iCs w:val="1"/>
       <w:color w:val="666666"/>
       <w:sz w:val="22"/>
       <w:szCs w:val="22"/>
@@ -1424,6 +1752,7 @@
     <w:rPr>
       <w:rFonts w:ascii="Arial" w:cs="Arial" w:eastAsia="Arial" w:hAnsi="Arial"/>
       <w:i w:val="0"/>
+      <w:iCs w:val="0"/>
       <w:color w:val="666666"/>
       <w:sz w:val="30"/>
       <w:szCs w:val="30"/>

</xml_diff>

<commit_message>
Add the safetychain position to resume page. Update resume downloadables
</commit_message>
<xml_diff>
--- a/assets/downloads/steven-stuart-resume.docx
+++ b/assets/downloads/steven-stuart-resume.docx
@@ -77,7 +77,7 @@
           <w:rFonts w:ascii="Cambria" w:cs="Cambria" w:eastAsia="Cambria" w:hAnsi="Cambria"/>
           <w:rtl w:val="0"/>
         </w:rPr>
-        <w:t xml:space="preserve"> | Location: Ave Maria, FL</w:t>
+        <w:t xml:space="preserve"> | Location: Boca Raton, FL</w:t>
       </w:r>
       <w:r>
         <w:rPr>
@@ -174,7 +174,7 @@
           <w:szCs w:val="26"/>
         </w:rPr>
       </w:pPr>
-      <w:bookmarkStart w:colFirst="0" w:colLast="0" w:name="_ypyubz1fpnea" w:id="2"/>
+      <w:bookmarkStart w:colFirst="0" w:colLast="0" w:name="_e8g2tekj8a9a" w:id="2"/>
       <w:bookmarkEnd w:id="2"/>
       <w:r>
         <w:rPr>
@@ -183,7 +183,287 @@
           <w:szCs w:val="26"/>
           <w:rtl w:val="0"/>
         </w:rPr>
-        <w:t xml:space="preserve">System Architect | True Market Insiders — St. Petersburg, FL | Feb 2023 – Present</w:t>
+        <w:t xml:space="preserve">Team Lead / Senior Software Developer | SafetyChain | March 2026 – Present</w:t>
+      </w:r>
+    </w:p>
+    <w:p>
+      <w:pPr>
+        <w:rPr>
+          <w:rFonts w:ascii="Cambria" w:cs="Cambria" w:eastAsia="Cambria" w:hAnsi="Cambria"/>
+        </w:rPr>
+      </w:pPr>
+      <w:r>
+        <w:rPr>
+          <w:rFonts w:ascii="Cambria" w:cs="Cambria" w:eastAsia="Cambria" w:hAnsi="Cambria"/>
+          <w:rtl w:val="0"/>
+        </w:rPr>
+        <w:t xml:space="preserve">Lead an engineering team responsible for rebuilding and maintaining a customer-facing Windows desktop application central to client record management. Collaborated with product and QA to keep the architecture aligned with evolving enterprise APIs and shared business logic across platforms.</w:t>
+      </w:r>
+    </w:p>
+    <w:p>
+      <w:pPr>
+        <w:rPr>
+          <w:rFonts w:ascii="Cambria" w:cs="Cambria" w:eastAsia="Cambria" w:hAnsi="Cambria"/>
+        </w:rPr>
+      </w:pPr>
+      <w:r>
+        <w:rPr>
+          <w:rtl w:val="0"/>
+        </w:rPr>
+      </w:r>
+    </w:p>
+    <w:p>
+      <w:pPr>
+        <w:rPr>
+          <w:rFonts w:ascii="Cambria" w:cs="Cambria" w:eastAsia="Cambria" w:hAnsi="Cambria"/>
+        </w:rPr>
+      </w:pPr>
+      <w:r>
+        <w:rPr>
+          <w:rFonts w:ascii="Cambria" w:cs="Cambria" w:eastAsia="Cambria" w:hAnsi="Cambria"/>
+          <w:b w:val="1"/>
+          <w:bCs w:val="1"/>
+          <w:rtl w:val="0"/>
+        </w:rPr>
+        <w:t xml:space="preserve">Key Achievements</w:t>
+      </w:r>
+      <w:r>
+        <w:rPr>
+          <w:rFonts w:ascii="Cambria" w:cs="Cambria" w:eastAsia="Cambria" w:hAnsi="Cambria"/>
+          <w:rtl w:val="0"/>
+        </w:rPr>
+        <w:t xml:space="preserve">:</w:t>
+      </w:r>
+    </w:p>
+    <w:p>
+      <w:pPr>
+        <w:numPr>
+          <w:ilvl w:val="0"/>
+          <w:numId w:val="3"/>
+        </w:numPr>
+        <w:ind w:left="720" w:hanging="360"/>
+        <w:rPr>
+          <w:rFonts w:ascii="Cambria" w:cs="Cambria" w:eastAsia="Cambria" w:hAnsi="Cambria"/>
+          <w:sz w:val="22"/>
+          <w:szCs w:val="22"/>
+        </w:rPr>
+      </w:pPr>
+      <w:r>
+        <w:rPr>
+          <w:rFonts w:ascii="Cambria" w:cs="Cambria" w:eastAsia="Cambria" w:hAnsi="Cambria"/>
+          <w:b w:val="1"/>
+          <w:bCs w:val="1"/>
+          <w:rtl w:val="0"/>
+        </w:rPr>
+        <w:t xml:space="preserve">Delivered in 4 months</w:t>
+      </w:r>
+      <w:r>
+        <w:rPr>
+          <w:rFonts w:ascii="Cambria" w:cs="Cambria" w:eastAsia="Cambria" w:hAnsi="Cambria"/>
+          <w:rtl w:val="0"/>
+        </w:rPr>
+        <w:t xml:space="preserve"> what had been stalled for two years, rescuing a legacy codebase and shipping a production-ready desktop application under a compressed deadline</w:t>
+      </w:r>
+    </w:p>
+    <w:p>
+      <w:pPr>
+        <w:numPr>
+          <w:ilvl w:val="0"/>
+          <w:numId w:val="3"/>
+        </w:numPr>
+        <w:ind w:left="720" w:hanging="360"/>
+        <w:rPr>
+          <w:rFonts w:ascii="Cambria" w:cs="Cambria" w:eastAsia="Cambria" w:hAnsi="Cambria"/>
+          <w:sz w:val="22"/>
+          <w:szCs w:val="22"/>
+        </w:rPr>
+      </w:pPr>
+      <w:r>
+        <w:rPr>
+          <w:rFonts w:ascii="Cambria" w:cs="Cambria" w:eastAsia="Cambria" w:hAnsi="Cambria"/>
+          <w:b w:val="1"/>
+          <w:bCs w:val="1"/>
+          <w:rtl w:val="0"/>
+        </w:rPr>
+        <w:t xml:space="preserve">Eliminated rework and plan drift</w:t>
+      </w:r>
+      <w:r>
+        <w:rPr>
+          <w:rFonts w:ascii="Cambria" w:cs="Cambria" w:eastAsia="Cambria" w:hAnsi="Cambria"/>
+          <w:rtl w:val="0"/>
+        </w:rPr>
+        <w:t xml:space="preserve"> by building a custom AI skill that enforced assumption validation before coding, producing structured task documents that captured intent, tested assumptions, and tracked progress for both active and historical reference</w:t>
+      </w:r>
+    </w:p>
+    <w:p>
+      <w:pPr>
+        <w:numPr>
+          <w:ilvl w:val="0"/>
+          <w:numId w:val="3"/>
+        </w:numPr>
+        <w:ind w:left="720" w:hanging="360"/>
+        <w:rPr>
+          <w:rFonts w:ascii="Cambria" w:cs="Cambria" w:eastAsia="Cambria" w:hAnsi="Cambria"/>
+          <w:sz w:val="22"/>
+          <w:szCs w:val="22"/>
+        </w:rPr>
+      </w:pPr>
+      <w:r>
+        <w:rPr>
+          <w:rFonts w:ascii="Cambria" w:cs="Cambria" w:eastAsia="Cambria" w:hAnsi="Cambria"/>
+          <w:b w:val="1"/>
+          <w:bCs w:val="1"/>
+          <w:rtl w:val="0"/>
+        </w:rPr>
+        <w:t xml:space="preserve">Cut AI coding costs and accelerated velocity</w:t>
+      </w:r>
+      <w:r>
+        <w:rPr>
+          <w:rFonts w:ascii="Cambria" w:cs="Cambria" w:eastAsia="Cambria" w:hAnsi="Cambria"/>
+          <w:rtl w:val="0"/>
+        </w:rPr>
+        <w:t xml:space="preserve"> by decomposing the codebase into single-responsibility components with a precise directory map, improving model accuracy on every code generation task and automatically maintaining the application’s technical guide as a byproduct</w:t>
+      </w:r>
+    </w:p>
+    <w:p>
+      <w:pPr>
+        <w:numPr>
+          <w:ilvl w:val="0"/>
+          <w:numId w:val="3"/>
+        </w:numPr>
+        <w:ind w:left="720" w:hanging="360"/>
+        <w:rPr>
+          <w:rFonts w:ascii="Cambria" w:cs="Cambria" w:eastAsia="Cambria" w:hAnsi="Cambria"/>
+          <w:sz w:val="22"/>
+          <w:szCs w:val="22"/>
+        </w:rPr>
+      </w:pPr>
+      <w:r>
+        <w:rPr>
+          <w:rFonts w:ascii="Cambria" w:cs="Cambria" w:eastAsia="Cambria" w:hAnsi="Cambria"/>
+          <w:b w:val="1"/>
+          <w:bCs w:val="1"/>
+          <w:rtl w:val="0"/>
+        </w:rPr>
+        <w:t xml:space="preserve">Resolved systemic performance and stability issues</w:t>
+      </w:r>
+      <w:r>
+        <w:rPr>
+          <w:rFonts w:ascii="Cambria" w:cs="Cambria" w:eastAsia="Cambria" w:hAnsi="Cambria"/>
+          <w:rtl w:val="0"/>
+        </w:rPr>
+        <w:t xml:space="preserve"> by migrating to a lightweight SQL data layer, fixing threading race conditions through a messaging pattern, and eliminating memory leaks through profiling and remediation</w:t>
+      </w:r>
+    </w:p>
+    <w:p>
+      <w:pPr>
+        <w:numPr>
+          <w:ilvl w:val="0"/>
+          <w:numId w:val="3"/>
+        </w:numPr>
+        <w:ind w:left="720" w:hanging="360"/>
+        <w:rPr>
+          <w:rFonts w:ascii="Cambria" w:cs="Cambria" w:eastAsia="Cambria" w:hAnsi="Cambria"/>
+          <w:sz w:val="22"/>
+          <w:szCs w:val="22"/>
+        </w:rPr>
+      </w:pPr>
+      <w:r>
+        <w:rPr>
+          <w:rFonts w:ascii="Cambria" w:cs="Cambria" w:eastAsia="Cambria" w:hAnsi="Cambria"/>
+          <w:b w:val="1"/>
+          <w:bCs w:val="1"/>
+          <w:rtl w:val="0"/>
+        </w:rPr>
+        <w:t xml:space="preserve">Reduced cloud costs by logging less and gaining more context</w:t>
+      </w:r>
+      <w:r>
+        <w:rPr>
+          <w:rFonts w:ascii="Cambria" w:cs="Cambria" w:eastAsia="Cambria" w:hAnsi="Cambria"/>
+          <w:rtl w:val="0"/>
+        </w:rPr>
+        <w:t xml:space="preserve"> by replacing blanket activity logging with deliberately authored observability, capturing only what mattered through structured logging and a local UI health indicator</w:t>
+      </w:r>
+    </w:p>
+    <w:p>
+      <w:pPr>
+        <w:numPr>
+          <w:ilvl w:val="0"/>
+          <w:numId w:val="3"/>
+        </w:numPr>
+        <w:ind w:left="720" w:hanging="360"/>
+        <w:rPr>
+          <w:rFonts w:ascii="Cambria" w:cs="Cambria" w:eastAsia="Cambria" w:hAnsi="Cambria"/>
+          <w:sz w:val="22"/>
+          <w:szCs w:val="22"/>
+        </w:rPr>
+      </w:pPr>
+      <w:r>
+        <w:rPr>
+          <w:rFonts w:ascii="Cambria" w:cs="Cambria" w:eastAsia="Cambria" w:hAnsi="Cambria"/>
+          <w:b w:val="1"/>
+          <w:bCs w:val="1"/>
+          <w:rtl w:val="0"/>
+        </w:rPr>
+        <w:t xml:space="preserve">Built the application’s first automated test suite</w:t>
+      </w:r>
+      <w:r>
+        <w:rPr>
+          <w:rFonts w:ascii="Cambria" w:cs="Cambria" w:eastAsia="Cambria" w:hAnsi="Cambria"/>
+          <w:rtl w:val="0"/>
+        </w:rPr>
+        <w:t xml:space="preserve"> from scratch using a use-case driven approach across all application layers</w:t>
+      </w:r>
+    </w:p>
+    <w:p>
+      <w:pPr>
+        <w:rPr>
+          <w:rFonts w:ascii="Cambria" w:cs="Cambria" w:eastAsia="Cambria" w:hAnsi="Cambria"/>
+        </w:rPr>
+      </w:pPr>
+      <w:r>
+        <w:rPr>
+          <w:rtl w:val="0"/>
+        </w:rPr>
+      </w:r>
+    </w:p>
+    <w:p>
+      <w:pPr>
+        <w:rPr>
+          <w:rFonts w:ascii="Cambria" w:cs="Cambria" w:eastAsia="Cambria" w:hAnsi="Cambria"/>
+          <w:i w:val="1"/>
+          <w:iCs w:val="1"/>
+        </w:rPr>
+      </w:pPr>
+      <w:r>
+        <w:rPr>
+          <w:rFonts w:ascii="Cambria" w:cs="Cambria" w:eastAsia="Cambria" w:hAnsi="Cambria"/>
+          <w:i w:val="1"/>
+          <w:iCs w:val="1"/>
+          <w:rtl w:val="0"/>
+        </w:rPr>
+        <w:t xml:space="preserve">Technologies: WinUI3, .NET, C#, MVVM, Dapper, SQLite, Serilog, AI Assistants</w:t>
+      </w:r>
+    </w:p>
+    <w:p>
+      <w:pPr>
+        <w:pStyle w:val="Heading3"/>
+        <w:rPr>
+          <w:rFonts w:ascii="Cambria" w:cs="Cambria" w:eastAsia="Cambria" w:hAnsi="Cambria"/>
+          <w:sz w:val="26"/>
+          <w:szCs w:val="26"/>
+        </w:rPr>
+      </w:pPr>
+      <w:bookmarkStart w:colFirst="0" w:colLast="0" w:name="_ypyubz1fpnea" w:id="3"/>
+      <w:bookmarkEnd w:id="3"/>
+      <w:r>
+        <w:rPr>
+          <w:rFonts w:ascii="Cambria" w:cs="Cambria" w:eastAsia="Cambria" w:hAnsi="Cambria"/>
+          <w:sz w:val="26"/>
+          <w:szCs w:val="26"/>
+          <w:rtl w:val="0"/>
+        </w:rPr>
+        <w:t xml:space="preserve">System Architect | True Market Insiders — St. Petersburg, FL | Feb 2023 – March 2026</w:t>
       </w:r>
     </w:p>
     <w:p>
@@ -252,7 +532,7 @@
       <w:pPr>
         <w:numPr>
           <w:ilvl w:val="0"/>
-          <w:numId w:val="4"/>
+          <w:numId w:val="5"/>
         </w:numPr>
         <w:ind w:left="720" w:hanging="360"/>
         <w:rPr>
@@ -282,7 +562,7 @@
       <w:pPr>
         <w:numPr>
           <w:ilvl w:val="0"/>
-          <w:numId w:val="4"/>
+          <w:numId w:val="5"/>
         </w:numPr>
         <w:ind w:left="720" w:hanging="360"/>
         <w:rPr>
@@ -312,7 +592,7 @@
       <w:pPr>
         <w:numPr>
           <w:ilvl w:val="0"/>
-          <w:numId w:val="4"/>
+          <w:numId w:val="5"/>
         </w:numPr>
         <w:ind w:left="720" w:hanging="360"/>
         <w:rPr>
@@ -342,7 +622,7 @@
       <w:pPr>
         <w:numPr>
           <w:ilvl w:val="0"/>
-          <w:numId w:val="4"/>
+          <w:numId w:val="5"/>
         </w:numPr>
         <w:ind w:left="720" w:hanging="360"/>
         <w:rPr>
@@ -372,7 +652,7 @@
       <w:pPr>
         <w:numPr>
           <w:ilvl w:val="0"/>
-          <w:numId w:val="4"/>
+          <w:numId w:val="5"/>
         </w:numPr>
         <w:ind w:left="720" w:hanging="360"/>
         <w:rPr>
@@ -402,7 +682,7 @@
       <w:pPr>
         <w:numPr>
           <w:ilvl w:val="0"/>
-          <w:numId w:val="4"/>
+          <w:numId w:val="5"/>
         </w:numPr>
         <w:ind w:left="720" w:hanging="360"/>
         <w:rPr>
@@ -432,7 +712,7 @@
       <w:pPr>
         <w:numPr>
           <w:ilvl w:val="0"/>
-          <w:numId w:val="4"/>
+          <w:numId w:val="5"/>
         </w:numPr>
         <w:ind w:left="720" w:hanging="360"/>
         <w:rPr>
@@ -502,8 +782,8 @@
           <w:szCs w:val="26"/>
         </w:rPr>
       </w:pPr>
-      <w:bookmarkStart w:colFirst="0" w:colLast="0" w:name="_9723osvu0eim" w:id="3"/>
-      <w:bookmarkEnd w:id="3"/>
+      <w:bookmarkStart w:colFirst="0" w:colLast="0" w:name="_9723osvu0eim" w:id="4"/>
+      <w:bookmarkEnd w:id="4"/>
       <w:r>
         <w:rPr>
           <w:rFonts w:ascii="Cambria" w:cs="Cambria" w:eastAsia="Cambria" w:hAnsi="Cambria"/>
@@ -705,8 +985,8 @@
           <w:szCs w:val="26"/>
         </w:rPr>
       </w:pPr>
-      <w:bookmarkStart w:colFirst="0" w:colLast="0" w:name="_5ug8hlelxkpr" w:id="4"/>
-      <w:bookmarkEnd w:id="4"/>
+      <w:bookmarkStart w:colFirst="0" w:colLast="0" w:name="_5ug8hlelxkpr" w:id="5"/>
+      <w:bookmarkEnd w:id="5"/>
       <w:r>
         <w:rPr>
           <w:rFonts w:ascii="Cambria" w:cs="Cambria" w:eastAsia="Cambria" w:hAnsi="Cambria"/>
@@ -765,7 +1045,7 @@
       <w:pPr>
         <w:numPr>
           <w:ilvl w:val="0"/>
-          <w:numId w:val="3"/>
+          <w:numId w:val="4"/>
         </w:numPr>
         <w:ind w:left="720" w:hanging="360"/>
         <w:rPr>
@@ -795,7 +1075,7 @@
       <w:pPr>
         <w:numPr>
           <w:ilvl w:val="0"/>
-          <w:numId w:val="3"/>
+          <w:numId w:val="4"/>
         </w:numPr>
         <w:ind w:left="720" w:hanging="360"/>
         <w:rPr>
@@ -825,7 +1105,7 @@
       <w:pPr>
         <w:numPr>
           <w:ilvl w:val="0"/>
-          <w:numId w:val="3"/>
+          <w:numId w:val="4"/>
         </w:numPr>
         <w:ind w:left="720" w:hanging="360"/>
         <w:rPr>
@@ -908,8 +1188,8 @@
           <w:szCs w:val="26"/>
         </w:rPr>
       </w:pPr>
-      <w:bookmarkStart w:colFirst="0" w:colLast="0" w:name="_svknel1ifu4j" w:id="5"/>
-      <w:bookmarkEnd w:id="5"/>
+      <w:bookmarkStart w:colFirst="0" w:colLast="0" w:name="_svknel1ifu4j" w:id="6"/>
+      <w:bookmarkEnd w:id="6"/>
       <w:r>
         <w:rPr>
           <w:rFonts w:ascii="Cambria" w:cs="Cambria" w:eastAsia="Cambria" w:hAnsi="Cambria"/>
@@ -1084,8 +1364,8 @@
           <w:szCs w:val="28"/>
         </w:rPr>
       </w:pPr>
-      <w:bookmarkStart w:colFirst="0" w:colLast="0" w:name="_9y5crfnw3hmg" w:id="6"/>
-      <w:bookmarkEnd w:id="6"/>
+      <w:bookmarkStart w:colFirst="0" w:colLast="0" w:name="_9y5crfnw3hmg" w:id="7"/>
+      <w:bookmarkEnd w:id="7"/>
       <w:r>
         <w:rPr>
           <w:rFonts w:ascii="Cambria" w:cs="Cambria" w:eastAsia="Cambria" w:hAnsi="Cambria"/>
@@ -1369,6 +1649,11 @@
       </w:pPr>
       <w:rPr>
         <w:rFonts w:ascii="Roboto" w:cs="Roboto" w:eastAsia="Roboto" w:hAnsi="Roboto"/>
+        <w:b w:val="0"/>
+        <w:bCs w:val="0"/>
+        <w:i w:val="0"/>
+        <w:iCs w:val="0"/>
+        <w:smallCaps w:val="0"/>
         <w:color w:val="2c3e50"/>
         <w:sz w:val="24"/>
         <w:szCs w:val="24"/>
@@ -1473,6 +1758,120 @@
     </w:lvl>
   </w:abstractNum>
   <w:abstractNum w:abstractNumId="4">
+    <w:lvl w:ilvl="0">
+      <w:start w:val="1"/>
+      <w:numFmt w:val="bullet"/>
+      <w:lvlText w:val="●"/>
+      <w:lvlJc w:val="left"/>
+      <w:pPr>
+        <w:ind w:left="720" w:hanging="360"/>
+      </w:pPr>
+      <w:rPr>
+        <w:rFonts w:ascii="Roboto" w:cs="Roboto" w:eastAsia="Roboto" w:hAnsi="Roboto"/>
+        <w:color w:val="2c3e50"/>
+        <w:sz w:val="24"/>
+        <w:szCs w:val="24"/>
+        <w:u w:val="none"/>
+      </w:rPr>
+    </w:lvl>
+    <w:lvl w:ilvl="1">
+      <w:start w:val="1"/>
+      <w:numFmt w:val="bullet"/>
+      <w:lvlText w:val="○"/>
+      <w:lvlJc w:val="left"/>
+      <w:pPr>
+        <w:ind w:left="1440" w:hanging="360"/>
+      </w:pPr>
+      <w:rPr>
+        <w:u w:val="none"/>
+      </w:rPr>
+    </w:lvl>
+    <w:lvl w:ilvl="2">
+      <w:start w:val="1"/>
+      <w:numFmt w:val="bullet"/>
+      <w:lvlText w:val="■"/>
+      <w:lvlJc w:val="left"/>
+      <w:pPr>
+        <w:ind w:left="2160" w:hanging="360"/>
+      </w:pPr>
+      <w:rPr>
+        <w:u w:val="none"/>
+      </w:rPr>
+    </w:lvl>
+    <w:lvl w:ilvl="3">
+      <w:start w:val="1"/>
+      <w:numFmt w:val="bullet"/>
+      <w:lvlText w:val="●"/>
+      <w:lvlJc w:val="left"/>
+      <w:pPr>
+        <w:ind w:left="2880" w:hanging="360"/>
+      </w:pPr>
+      <w:rPr>
+        <w:u w:val="none"/>
+      </w:rPr>
+    </w:lvl>
+    <w:lvl w:ilvl="4">
+      <w:start w:val="1"/>
+      <w:numFmt w:val="bullet"/>
+      <w:lvlText w:val="○"/>
+      <w:lvlJc w:val="left"/>
+      <w:pPr>
+        <w:ind w:left="3600" w:hanging="360"/>
+      </w:pPr>
+      <w:rPr>
+        <w:u w:val="none"/>
+      </w:rPr>
+    </w:lvl>
+    <w:lvl w:ilvl="5">
+      <w:start w:val="1"/>
+      <w:numFmt w:val="bullet"/>
+      <w:lvlText w:val="■"/>
+      <w:lvlJc w:val="left"/>
+      <w:pPr>
+        <w:ind w:left="4320" w:hanging="360"/>
+      </w:pPr>
+      <w:rPr>
+        <w:u w:val="none"/>
+      </w:rPr>
+    </w:lvl>
+    <w:lvl w:ilvl="6">
+      <w:start w:val="1"/>
+      <w:numFmt w:val="bullet"/>
+      <w:lvlText w:val="●"/>
+      <w:lvlJc w:val="left"/>
+      <w:pPr>
+        <w:ind w:left="5040" w:hanging="360"/>
+      </w:pPr>
+      <w:rPr>
+        <w:u w:val="none"/>
+      </w:rPr>
+    </w:lvl>
+    <w:lvl w:ilvl="7">
+      <w:start w:val="1"/>
+      <w:numFmt w:val="bullet"/>
+      <w:lvlText w:val="○"/>
+      <w:lvlJc w:val="left"/>
+      <w:pPr>
+        <w:ind w:left="5760" w:hanging="360"/>
+      </w:pPr>
+      <w:rPr>
+        <w:u w:val="none"/>
+      </w:rPr>
+    </w:lvl>
+    <w:lvl w:ilvl="8">
+      <w:start w:val="1"/>
+      <w:numFmt w:val="bullet"/>
+      <w:lvlText w:val="■"/>
+      <w:lvlJc w:val="left"/>
+      <w:pPr>
+        <w:ind w:left="6480" w:hanging="360"/>
+      </w:pPr>
+      <w:rPr>
+        <w:u w:val="none"/>
+      </w:rPr>
+    </w:lvl>
+  </w:abstractNum>
+  <w:abstractNum w:abstractNumId="5">
     <w:lvl w:ilvl="0">
       <w:start w:val="1"/>
       <w:numFmt w:val="bullet"/>
@@ -1597,6 +1996,9 @@
   </w:num>
   <w:num w:numId="4">
     <w:abstractNumId w:val="4"/>
+  </w:num>
+  <w:num w:numId="5">
+    <w:abstractNumId w:val="5"/>
   </w:num>
 </w:numbering>
 </file>

</xml_diff>